<commit_message>
Implement YOLOv8-seg food cropping for Vegan vs Vegetarian, boosting restaurant accuracy from 83.33% to 95.83%
</commit_message>
<xml_diff>
--- a/Vegan_vs_Vegetarian_Classifier/docs/Vegan_vs_Vegetarian_Intelligence_Report.docx
+++ b/Vegan_vs_Vegetarian_Classifier/docs/Vegan_vs_Vegetarian_Intelligence_Report.docx
@@ -4,18 +4,16 @@
   <w:body>
     <w:p>
       <w:pPr>
+        <w:pStyle w:val="Title"/>
         <w:jc w:val="center"/>
       </w:pPr>
       <w:r>
         <w:rPr>
+          <w:rFonts w:ascii="Segoe UI" w:hAnsi="Segoe UI"/>
           <w:b/>
           <w:color w:val="1F3864"/>
-          <w:sz w:val="44"/>
         </w:rPr>
-        <w:br/>
-        <w:t>🌱 DishDetect SA</w:t>
-        <w:br/>
-        <w:t>VEGAN VS. VEGETARIAN (MEAT-FREE) INTELLIGENCE REPORT</w:t>
+        <w:t>DishDetect SA: Vegan vs. Vegetarian Intelligence Report</w:t>
       </w:r>
     </w:p>
     <w:p>
@@ -26,11 +24,11 @@
         <w:rPr>
           <w:i/>
           <w:color w:val="595959"/>
-          <w:sz w:val="22"/>
+          <w:sz w:val="20"/>
         </w:rPr>
-        <w:t>Deep Learning Discrimination of Plant-Based vs. Dairy/Egg/Ghee Arabic Dishes</w:t>
+        <w:t>Meat-Free Cohort Analysis (15 Dishes) &amp; YOLOv8-Seg Polygon Cropping Benchmark</w:t>
         <w:br/>
-        <w:t>13 October 2026</w:t>
+        <w:t>Date: October 2026 · Confidential &amp; Proprietary Research Document</w:t>
       </w:r>
     </w:p>
     <w:p/>
@@ -44,41 +42,51 @@
           <w:rFonts w:ascii="Segoe UI" w:hAnsi="Segoe UI"/>
           <w:color w:val="1F3864"/>
         </w:rPr>
-        <w:t>1. Executive Summary</w:t>
+        <w:t>1. Executive Summary &amp; Breakthrough Results</w:t>
       </w:r>
     </w:p>
     <w:p>
+      <w:pPr>
+        <w:spacing w:line="276" w:lineRule="auto" w:after="120"/>
+      </w:pPr>
       <w:r>
         <w:rPr>
           <w:rFonts w:ascii="Segoe UI" w:hAnsi="Segoe UI"/>
-          <w:b w:val="0"/>
-          <w:i w:val="0"/>
-          <w:color w:val="262626"/>
+          <w:color w:val="333333"/>
           <w:sz w:val="20"/>
         </w:rPr>
-        <w:t>In modern dietary compliance and nutrition technology, identifying whether a dish contains animal products requires going beyond detecting meat. While vegetarians abstain from animal flesh, they frequently consume dairy (cheese, milk, yogurt), eggs, and clarified butter (samneh / ghee). In contrast, strict vegans require 100% plant-based foods. This report documents the dedicated Vegan vs. Vegetarian classification model trained on the meat-free cohort of 15 Middle Eastern / Arabic dishes, completely excluding all 10 meat/fish categories.</w:t>
+        <w:t>In culinary AI, identifying whether a meatless meal is vegan requires analyzing invisible or subtle dairy byproducts (cheese, butter, eggs, milk, ashta cream, and samneh / clarified butter). In Middle Eastern cuisine, flatbreads and pastries often present confusing visual textures: for example, Za’atar Manaqish (wild thyme in olive oil) can visually mimic melted cheese under reflective restaurant spotlights, while table clutter introduces extraneous noise. To resolve this, we implemented Strategy 1 (YOLOv8-Seg Polygon Mask Food Cropping) to isolate the edible food mass. The model achieved an exceptional 95.83% accuracy on real-world unseen restaurant photography (+12.50% boost over uncropped baseline), eliminating false classifications on Za’atar Manaqish completely.</w:t>
       </w:r>
     </w:p>
     <w:tbl>
       <w:tblPr>
-        <w:tblStyle w:val="TableGrid"/>
         <w:tblW w:type="auto" w:w="0"/>
         <w:jc w:val="center"/>
+        <w:tblLayout w:type="fixed"/>
         <w:tblLook w:firstColumn="1" w:firstRow="1" w:lastColumn="0" w:lastRow="0" w:noHBand="0" w:noVBand="1" w:val="04A0"/>
       </w:tblPr>
       <w:tblGrid>
-        <w:gridCol w:w="2436"/>
-        <w:gridCol w:w="2436"/>
-        <w:gridCol w:w="2436"/>
-        <w:gridCol w:w="2436"/>
+        <w:gridCol w:w="2160"/>
+        <w:gridCol w:w="2160"/>
+        <w:gridCol w:w="2160"/>
+        <w:gridCol w:w="2160"/>
       </w:tblGrid>
       <w:tr>
         <w:tc>
           <w:tcPr>
-            <w:tcW w:type="dxa" w:w="2436"/>
+            <w:tcW w:type="dxa" w:w="2160"/>
             <w:shd w:val="clear" w:color="auto" w:fill="1F3864"/>
+            <w:tcBorders>
+              <w:top w:val="single" w:sz="4" w:space="0" w:color="D9D9D9"/>
+              <w:left w:val="single" w:sz="4" w:space="0" w:color="D9D9D9"/>
+              <w:bottom w:val="single" w:sz="4" w:space="0" w:color="D9D9D9"/>
+              <w:right w:val="single" w:sz="4" w:space="0" w:color="D9D9D9"/>
+            </w:tcBorders>
           </w:tcPr>
           <w:p>
+            <w:pPr>
+              <w:jc w:val="center"/>
+            </w:pPr>
             <w:r>
               <w:rPr>
                 <w:rFonts w:ascii="Segoe UI" w:hAnsi="Segoe UI"/>
@@ -92,10 +100,19 @@
         </w:tc>
         <w:tc>
           <w:tcPr>
-            <w:tcW w:type="dxa" w:w="2436"/>
+            <w:tcW w:type="dxa" w:w="2160"/>
             <w:shd w:val="clear" w:color="auto" w:fill="1F3864"/>
+            <w:tcBorders>
+              <w:top w:val="single" w:sz="4" w:space="0" w:color="D9D9D9"/>
+              <w:left w:val="single" w:sz="4" w:space="0" w:color="D9D9D9"/>
+              <w:bottom w:val="single" w:sz="4" w:space="0" w:color="D9D9D9"/>
+              <w:right w:val="single" w:sz="4" w:space="0" w:color="D9D9D9"/>
+            </w:tcBorders>
           </w:tcPr>
           <w:p>
+            <w:pPr>
+              <w:jc w:val="center"/>
+            </w:pPr>
             <w:r>
               <w:rPr>
                 <w:rFonts w:ascii="Segoe UI" w:hAnsi="Segoe UI"/>
@@ -103,16 +120,25 @@
                 <w:color w:val="FFFFFF"/>
                 <w:sz w:val="19"/>
               </w:rPr>
-              <w:t>Validation Set (107 imgs)</w:t>
+              <w:t>Uncropped Baseline</w:t>
             </w:r>
           </w:p>
         </w:tc>
         <w:tc>
           <w:tcPr>
-            <w:tcW w:type="dxa" w:w="2436"/>
+            <w:tcW w:type="dxa" w:w="2160"/>
             <w:shd w:val="clear" w:color="auto" w:fill="1F3864"/>
+            <w:tcBorders>
+              <w:top w:val="single" w:sz="4" w:space="0" w:color="D9D9D9"/>
+              <w:left w:val="single" w:sz="4" w:space="0" w:color="D9D9D9"/>
+              <w:bottom w:val="single" w:sz="4" w:space="0" w:color="D9D9D9"/>
+              <w:right w:val="single" w:sz="4" w:space="0" w:color="D9D9D9"/>
+            </w:tcBorders>
           </w:tcPr>
           <w:p>
+            <w:pPr>
+              <w:jc w:val="center"/>
+            </w:pPr>
             <w:r>
               <w:rPr>
                 <w:rFonts w:ascii="Segoe UI" w:hAnsi="Segoe UI"/>
@@ -120,16 +146,25 @@
                 <w:color w:val="FFFFFF"/>
                 <w:sz w:val="19"/>
               </w:rPr>
-              <w:t>Held-Out Test Set (107 imgs)</w:t>
+              <w:t>YOLOv8-Seg Cropped</w:t>
             </w:r>
           </w:p>
         </w:tc>
         <w:tc>
           <w:tcPr>
-            <w:tcW w:type="dxa" w:w="2436"/>
+            <w:tcW w:type="dxa" w:w="2160"/>
             <w:shd w:val="clear" w:color="auto" w:fill="1F3864"/>
+            <w:tcBorders>
+              <w:top w:val="single" w:sz="4" w:space="0" w:color="D9D9D9"/>
+              <w:left w:val="single" w:sz="4" w:space="0" w:color="D9D9D9"/>
+              <w:bottom w:val="single" w:sz="4" w:space="0" w:color="D9D9D9"/>
+              <w:right w:val="single" w:sz="4" w:space="0" w:color="D9D9D9"/>
+            </w:tcBorders>
           </w:tcPr>
           <w:p>
+            <w:pPr>
+              <w:jc w:val="center"/>
+            </w:pPr>
             <w:r>
               <w:rPr>
                 <w:rFonts w:ascii="Segoe UI" w:hAnsi="Segoe UI"/>
@@ -137,7 +172,7 @@
                 <w:color w:val="FFFFFF"/>
                 <w:sz w:val="19"/>
               </w:rPr>
-              <w:t>Real Restaurant Test (24 imgs)</w:t>
+              <w:t>Observed Delta / Impact</w:t>
             </w:r>
           </w:p>
         </w:tc>
@@ -145,61 +180,102 @@
       <w:tr>
         <w:tc>
           <w:tcPr>
-            <w:tcW w:type="dxa" w:w="2436"/>
-            <w:shd w:val="clear" w:color="auto" w:fill="F2F6FC"/>
+            <w:tcW w:type="dxa" w:w="2160"/>
+            <w:shd w:val="clear" w:color="auto" w:fill="FFFFFF"/>
+            <w:tcBorders>
+              <w:top w:val="single" w:sz="4" w:space="0" w:color="D9D9D9"/>
+              <w:left w:val="single" w:sz="4" w:space="0" w:color="D9D9D9"/>
+              <w:bottom w:val="single" w:sz="4" w:space="0" w:color="D9D9D9"/>
+              <w:right w:val="single" w:sz="4" w:space="0" w:color="D9D9D9"/>
+            </w:tcBorders>
           </w:tcPr>
           <w:p>
+            <w:pPr>
+              <w:jc w:val="left"/>
+            </w:pPr>
             <w:r>
               <w:rPr>
                 <w:rFonts w:ascii="Segoe UI" w:hAnsi="Segoe UI"/>
+                <w:b/>
+                <w:color w:val="1F3864"/>
                 <w:sz w:val="18"/>
               </w:rPr>
-              <w:t>Overall Accuracy</w:t>
+              <w:t>Real-World Restaurant Accuracy</w:t>
             </w:r>
           </w:p>
         </w:tc>
         <w:tc>
           <w:tcPr>
-            <w:tcW w:type="dxa" w:w="2436"/>
-            <w:shd w:val="clear" w:color="auto" w:fill="F2F6FC"/>
+            <w:tcW w:type="dxa" w:w="2160"/>
+            <w:shd w:val="clear" w:color="auto" w:fill="FFFFFF"/>
+            <w:tcBorders>
+              <w:top w:val="single" w:sz="4" w:space="0" w:color="D9D9D9"/>
+              <w:left w:val="single" w:sz="4" w:space="0" w:color="D9D9D9"/>
+              <w:bottom w:val="single" w:sz="4" w:space="0" w:color="D9D9D9"/>
+              <w:right w:val="single" w:sz="4" w:space="0" w:color="D9D9D9"/>
+            </w:tcBorders>
           </w:tcPr>
           <w:p>
+            <w:pPr>
+              <w:jc w:val="center"/>
+            </w:pPr>
             <w:r>
               <w:rPr>
                 <w:rFonts w:ascii="Segoe UI" w:hAnsi="Segoe UI"/>
+                <w:color w:val="333333"/>
                 <w:sz w:val="18"/>
               </w:rPr>
-              <w:t>88.79%</w:t>
+              <w:t>83.33% (20 / 24)</w:t>
             </w:r>
           </w:p>
         </w:tc>
         <w:tc>
           <w:tcPr>
-            <w:tcW w:type="dxa" w:w="2436"/>
-            <w:shd w:val="clear" w:color="auto" w:fill="F2F6FC"/>
+            <w:tcW w:type="dxa" w:w="2160"/>
+            <w:shd w:val="clear" w:color="auto" w:fill="FFFFFF"/>
+            <w:tcBorders>
+              <w:top w:val="single" w:sz="4" w:space="0" w:color="D9D9D9"/>
+              <w:left w:val="single" w:sz="4" w:space="0" w:color="D9D9D9"/>
+              <w:bottom w:val="single" w:sz="4" w:space="0" w:color="D9D9D9"/>
+              <w:right w:val="single" w:sz="4" w:space="0" w:color="D9D9D9"/>
+            </w:tcBorders>
           </w:tcPr>
           <w:p>
+            <w:pPr>
+              <w:jc w:val="center"/>
+            </w:pPr>
             <w:r>
               <w:rPr>
                 <w:rFonts w:ascii="Segoe UI" w:hAnsi="Segoe UI"/>
+                <w:color w:val="333333"/>
                 <w:sz w:val="18"/>
               </w:rPr>
-              <w:t>87.85%</w:t>
+              <w:t>95.83% (23 / 24)</w:t>
             </w:r>
           </w:p>
         </w:tc>
         <w:tc>
           <w:tcPr>
-            <w:tcW w:type="dxa" w:w="2436"/>
-            <w:shd w:val="clear" w:color="auto" w:fill="F2F6FC"/>
+            <w:tcW w:type="dxa" w:w="2160"/>
+            <w:shd w:val="clear" w:color="auto" w:fill="FFFFFF"/>
+            <w:tcBorders>
+              <w:top w:val="single" w:sz="4" w:space="0" w:color="D9D9D9"/>
+              <w:left w:val="single" w:sz="4" w:space="0" w:color="D9D9D9"/>
+              <w:bottom w:val="single" w:sz="4" w:space="0" w:color="D9D9D9"/>
+              <w:right w:val="single" w:sz="4" w:space="0" w:color="D9D9D9"/>
+            </w:tcBorders>
           </w:tcPr>
           <w:p>
+            <w:pPr>
+              <w:jc w:val="center"/>
+            </w:pPr>
             <w:r>
               <w:rPr>
                 <w:rFonts w:ascii="Segoe UI" w:hAnsi="Segoe UI"/>
+                <w:color w:val="333333"/>
                 <w:sz w:val="18"/>
               </w:rPr>
-              <w:t>83.33%</w:t>
+              <w:t>+12.50% (Significant real-world gain)</w:t>
             </w:r>
           </w:p>
         </w:tc>
@@ -207,61 +283,102 @@
       <w:tr>
         <w:tc>
           <w:tcPr>
-            <w:tcW w:type="dxa" w:w="2436"/>
-            <w:shd w:val="clear" w:color="auto" w:fill="FFFFFF"/>
+            <w:tcW w:type="dxa" w:w="2160"/>
+            <w:shd w:val="clear" w:color="auto" w:fill="F2F6FC"/>
+            <w:tcBorders>
+              <w:top w:val="single" w:sz="4" w:space="0" w:color="D9D9D9"/>
+              <w:left w:val="single" w:sz="4" w:space="0" w:color="D9D9D9"/>
+              <w:bottom w:val="single" w:sz="4" w:space="0" w:color="D9D9D9"/>
+              <w:right w:val="single" w:sz="4" w:space="0" w:color="D9D9D9"/>
+            </w:tcBorders>
           </w:tcPr>
           <w:p>
+            <w:pPr>
+              <w:jc w:val="left"/>
+            </w:pPr>
             <w:r>
               <w:rPr>
                 <w:rFonts w:ascii="Segoe UI" w:hAnsi="Segoe UI"/>
+                <w:b/>
+                <w:color w:val="1F3864"/>
                 <w:sz w:val="18"/>
               </w:rPr>
-              <w:t>Weighted Precision</w:t>
+              <w:t>Za’atar Manaqish Restaurant Acc.</w:t>
             </w:r>
           </w:p>
         </w:tc>
         <w:tc>
           <w:tcPr>
-            <w:tcW w:type="dxa" w:w="2436"/>
-            <w:shd w:val="clear" w:color="auto" w:fill="FFFFFF"/>
+            <w:tcW w:type="dxa" w:w="2160"/>
+            <w:shd w:val="clear" w:color="auto" w:fill="F2F6FC"/>
+            <w:tcBorders>
+              <w:top w:val="single" w:sz="4" w:space="0" w:color="D9D9D9"/>
+              <w:left w:val="single" w:sz="4" w:space="0" w:color="D9D9D9"/>
+              <w:bottom w:val="single" w:sz="4" w:space="0" w:color="D9D9D9"/>
+              <w:right w:val="single" w:sz="4" w:space="0" w:color="D9D9D9"/>
+            </w:tcBorders>
           </w:tcPr>
           <w:p>
+            <w:pPr>
+              <w:jc w:val="center"/>
+            </w:pPr>
             <w:r>
               <w:rPr>
                 <w:rFonts w:ascii="Segoe UI" w:hAnsi="Segoe UI"/>
+                <w:color w:val="333333"/>
                 <w:sz w:val="18"/>
               </w:rPr>
-              <w:t>0.8879</w:t>
+              <w:t>40.0% (2 / 5)</w:t>
             </w:r>
           </w:p>
         </w:tc>
         <w:tc>
           <w:tcPr>
-            <w:tcW w:type="dxa" w:w="2436"/>
-            <w:shd w:val="clear" w:color="auto" w:fill="FFFFFF"/>
+            <w:tcW w:type="dxa" w:w="2160"/>
+            <w:shd w:val="clear" w:color="auto" w:fill="F2F6FC"/>
+            <w:tcBorders>
+              <w:top w:val="single" w:sz="4" w:space="0" w:color="D9D9D9"/>
+              <w:left w:val="single" w:sz="4" w:space="0" w:color="D9D9D9"/>
+              <w:bottom w:val="single" w:sz="4" w:space="0" w:color="D9D9D9"/>
+              <w:right w:val="single" w:sz="4" w:space="0" w:color="D9D9D9"/>
+            </w:tcBorders>
           </w:tcPr>
           <w:p>
+            <w:pPr>
+              <w:jc w:val="center"/>
+            </w:pPr>
             <w:r>
               <w:rPr>
                 <w:rFonts w:ascii="Segoe UI" w:hAnsi="Segoe UI"/>
+                <w:color w:val="333333"/>
                 <w:sz w:val="18"/>
               </w:rPr>
-              <w:t>0.8875</w:t>
+              <w:t>100.0% (5 / 5)</w:t>
             </w:r>
           </w:p>
         </w:tc>
         <w:tc>
           <w:tcPr>
-            <w:tcW w:type="dxa" w:w="2436"/>
-            <w:shd w:val="clear" w:color="auto" w:fill="FFFFFF"/>
+            <w:tcW w:type="dxa" w:w="2160"/>
+            <w:shd w:val="clear" w:color="auto" w:fill="F2F6FC"/>
+            <w:tcBorders>
+              <w:top w:val="single" w:sz="4" w:space="0" w:color="D9D9D9"/>
+              <w:left w:val="single" w:sz="4" w:space="0" w:color="D9D9D9"/>
+              <w:bottom w:val="single" w:sz="4" w:space="0" w:color="D9D9D9"/>
+              <w:right w:val="single" w:sz="4" w:space="0" w:color="D9D9D9"/>
+            </w:tcBorders>
           </w:tcPr>
           <w:p>
+            <w:pPr>
+              <w:jc w:val="center"/>
+            </w:pPr>
             <w:r>
               <w:rPr>
                 <w:rFonts w:ascii="Segoe UI" w:hAnsi="Segoe UI"/>
+                <w:color w:val="333333"/>
                 <w:sz w:val="18"/>
               </w:rPr>
-              <w:t>—</w:t>
+              <w:t>+60.0% (Zero false cheese predictions)</w:t>
             </w:r>
           </w:p>
         </w:tc>
@@ -269,61 +386,102 @@
       <w:tr>
         <w:tc>
           <w:tcPr>
-            <w:tcW w:type="dxa" w:w="2436"/>
-            <w:shd w:val="clear" w:color="auto" w:fill="F2F6FC"/>
+            <w:tcW w:type="dxa" w:w="2160"/>
+            <w:shd w:val="clear" w:color="auto" w:fill="FFFFFF"/>
+            <w:tcBorders>
+              <w:top w:val="single" w:sz="4" w:space="0" w:color="D9D9D9"/>
+              <w:left w:val="single" w:sz="4" w:space="0" w:color="D9D9D9"/>
+              <w:bottom w:val="single" w:sz="4" w:space="0" w:color="D9D9D9"/>
+              <w:right w:val="single" w:sz="4" w:space="0" w:color="D9D9D9"/>
+            </w:tcBorders>
           </w:tcPr>
           <w:p>
+            <w:pPr>
+              <w:jc w:val="left"/>
+            </w:pPr>
             <w:r>
               <w:rPr>
                 <w:rFonts w:ascii="Segoe UI" w:hAnsi="Segoe UI"/>
+                <w:b/>
+                <w:color w:val="1F3864"/>
                 <w:sz w:val="18"/>
               </w:rPr>
-              <w:t>Weighted Recall</w:t>
+              <w:t>Held-Out Test Accuracy</w:t>
             </w:r>
           </w:p>
         </w:tc>
         <w:tc>
           <w:tcPr>
-            <w:tcW w:type="dxa" w:w="2436"/>
-            <w:shd w:val="clear" w:color="auto" w:fill="F2F6FC"/>
+            <w:tcW w:type="dxa" w:w="2160"/>
+            <w:shd w:val="clear" w:color="auto" w:fill="FFFFFF"/>
+            <w:tcBorders>
+              <w:top w:val="single" w:sz="4" w:space="0" w:color="D9D9D9"/>
+              <w:left w:val="single" w:sz="4" w:space="0" w:color="D9D9D9"/>
+              <w:bottom w:val="single" w:sz="4" w:space="0" w:color="D9D9D9"/>
+              <w:right w:val="single" w:sz="4" w:space="0" w:color="D9D9D9"/>
+            </w:tcBorders>
           </w:tcPr>
           <w:p>
+            <w:pPr>
+              <w:jc w:val="center"/>
+            </w:pPr>
             <w:r>
               <w:rPr>
                 <w:rFonts w:ascii="Segoe UI" w:hAnsi="Segoe UI"/>
+                <w:color w:val="333333"/>
                 <w:sz w:val="18"/>
               </w:rPr>
-              <w:t>0.8879</w:t>
+              <w:t>85.05%</w:t>
             </w:r>
           </w:p>
         </w:tc>
         <w:tc>
           <w:tcPr>
-            <w:tcW w:type="dxa" w:w="2436"/>
-            <w:shd w:val="clear" w:color="auto" w:fill="F2F6FC"/>
+            <w:tcW w:type="dxa" w:w="2160"/>
+            <w:shd w:val="clear" w:color="auto" w:fill="FFFFFF"/>
+            <w:tcBorders>
+              <w:top w:val="single" w:sz="4" w:space="0" w:color="D9D9D9"/>
+              <w:left w:val="single" w:sz="4" w:space="0" w:color="D9D9D9"/>
+              <w:bottom w:val="single" w:sz="4" w:space="0" w:color="D9D9D9"/>
+              <w:right w:val="single" w:sz="4" w:space="0" w:color="D9D9D9"/>
+            </w:tcBorders>
           </w:tcPr>
           <w:p>
+            <w:pPr>
+              <w:jc w:val="center"/>
+            </w:pPr>
             <w:r>
               <w:rPr>
                 <w:rFonts w:ascii="Segoe UI" w:hAnsi="Segoe UI"/>
+                <w:color w:val="333333"/>
                 <w:sz w:val="18"/>
               </w:rPr>
-              <w:t>0.8785</w:t>
+              <w:t>85.58%</w:t>
             </w:r>
           </w:p>
         </w:tc>
         <w:tc>
           <w:tcPr>
-            <w:tcW w:type="dxa" w:w="2436"/>
-            <w:shd w:val="clear" w:color="auto" w:fill="F2F6FC"/>
+            <w:tcW w:type="dxa" w:w="2160"/>
+            <w:shd w:val="clear" w:color="auto" w:fill="FFFFFF"/>
+            <w:tcBorders>
+              <w:top w:val="single" w:sz="4" w:space="0" w:color="D9D9D9"/>
+              <w:left w:val="single" w:sz="4" w:space="0" w:color="D9D9D9"/>
+              <w:bottom w:val="single" w:sz="4" w:space="0" w:color="D9D9D9"/>
+              <w:right w:val="single" w:sz="4" w:space="0" w:color="D9D9D9"/>
+            </w:tcBorders>
           </w:tcPr>
           <w:p>
+            <w:pPr>
+              <w:jc w:val="center"/>
+            </w:pPr>
             <w:r>
               <w:rPr>
                 <w:rFonts w:ascii="Segoe UI" w:hAnsi="Segoe UI"/>
+                <w:color w:val="333333"/>
                 <w:sz w:val="18"/>
               </w:rPr>
-              <w:t>—</w:t>
+              <w:t>+0.53% (Consistent generalization)</w:t>
             </w:r>
           </w:p>
         </w:tc>
@@ -331,61 +489,102 @@
       <w:tr>
         <w:tc>
           <w:tcPr>
-            <w:tcW w:type="dxa" w:w="2436"/>
-            <w:shd w:val="clear" w:color="auto" w:fill="FFFFFF"/>
+            <w:tcW w:type="dxa" w:w="2160"/>
+            <w:shd w:val="clear" w:color="auto" w:fill="F2F6FC"/>
+            <w:tcBorders>
+              <w:top w:val="single" w:sz="4" w:space="0" w:color="D9D9D9"/>
+              <w:left w:val="single" w:sz="4" w:space="0" w:color="D9D9D9"/>
+              <w:bottom w:val="single" w:sz="4" w:space="0" w:color="D9D9D9"/>
+              <w:right w:val="single" w:sz="4" w:space="0" w:color="D9D9D9"/>
+            </w:tcBorders>
           </w:tcPr>
           <w:p>
+            <w:pPr>
+              <w:jc w:val="left"/>
+            </w:pPr>
             <w:r>
               <w:rPr>
                 <w:rFonts w:ascii="Segoe UI" w:hAnsi="Segoe UI"/>
+                <w:b/>
+                <w:color w:val="1F3864"/>
                 <w:sz w:val="18"/>
               </w:rPr>
-              <w:t>Weighted F1-Score</w:t>
+              <w:t>Vegan Held-Out Recall</w:t>
             </w:r>
           </w:p>
         </w:tc>
         <w:tc>
           <w:tcPr>
-            <w:tcW w:type="dxa" w:w="2436"/>
-            <w:shd w:val="clear" w:color="auto" w:fill="FFFFFF"/>
+            <w:tcW w:type="dxa" w:w="2160"/>
+            <w:shd w:val="clear" w:color="auto" w:fill="F2F6FC"/>
+            <w:tcBorders>
+              <w:top w:val="single" w:sz="4" w:space="0" w:color="D9D9D9"/>
+              <w:left w:val="single" w:sz="4" w:space="0" w:color="D9D9D9"/>
+              <w:bottom w:val="single" w:sz="4" w:space="0" w:color="D9D9D9"/>
+              <w:right w:val="single" w:sz="4" w:space="0" w:color="D9D9D9"/>
+            </w:tcBorders>
           </w:tcPr>
           <w:p>
+            <w:pPr>
+              <w:jc w:val="center"/>
+            </w:pPr>
             <w:r>
               <w:rPr>
                 <w:rFonts w:ascii="Segoe UI" w:hAnsi="Segoe UI"/>
+                <w:color w:val="333333"/>
                 <w:sz w:val="18"/>
               </w:rPr>
-              <w:t>0.8879</w:t>
+              <w:t>79.03%</w:t>
             </w:r>
           </w:p>
         </w:tc>
         <w:tc>
           <w:tcPr>
-            <w:tcW w:type="dxa" w:w="2436"/>
-            <w:shd w:val="clear" w:color="auto" w:fill="FFFFFF"/>
+            <w:tcW w:type="dxa" w:w="2160"/>
+            <w:shd w:val="clear" w:color="auto" w:fill="F2F6FC"/>
+            <w:tcBorders>
+              <w:top w:val="single" w:sz="4" w:space="0" w:color="D9D9D9"/>
+              <w:left w:val="single" w:sz="4" w:space="0" w:color="D9D9D9"/>
+              <w:bottom w:val="single" w:sz="4" w:space="0" w:color="D9D9D9"/>
+              <w:right w:val="single" w:sz="4" w:space="0" w:color="D9D9D9"/>
+            </w:tcBorders>
           </w:tcPr>
           <w:p>
+            <w:pPr>
+              <w:jc w:val="center"/>
+            </w:pPr>
             <w:r>
               <w:rPr>
                 <w:rFonts w:ascii="Segoe UI" w:hAnsi="Segoe UI"/>
+                <w:color w:val="333333"/>
                 <w:sz w:val="18"/>
               </w:rPr>
-              <w:t>0.8793</w:t>
+              <w:t>83.61%</w:t>
             </w:r>
           </w:p>
         </w:tc>
         <w:tc>
           <w:tcPr>
-            <w:tcW w:type="dxa" w:w="2436"/>
-            <w:shd w:val="clear" w:color="auto" w:fill="FFFFFF"/>
+            <w:tcW w:type="dxa" w:w="2160"/>
+            <w:shd w:val="clear" w:color="auto" w:fill="F2F6FC"/>
+            <w:tcBorders>
+              <w:top w:val="single" w:sz="4" w:space="0" w:color="D9D9D9"/>
+              <w:left w:val="single" w:sz="4" w:space="0" w:color="D9D9D9"/>
+              <w:bottom w:val="single" w:sz="4" w:space="0" w:color="D9D9D9"/>
+              <w:right w:val="single" w:sz="4" w:space="0" w:color="D9D9D9"/>
+            </w:tcBorders>
           </w:tcPr>
           <w:p>
+            <w:pPr>
+              <w:jc w:val="center"/>
+            </w:pPr>
             <w:r>
               <w:rPr>
                 <w:rFonts w:ascii="Segoe UI" w:hAnsi="Segoe UI"/>
+                <w:color w:val="333333"/>
                 <w:sz w:val="18"/>
               </w:rPr>
-              <w:t>—</w:t>
+              <w:t>+4.58% (Fewer missed vegan dishes)</w:t>
             </w:r>
           </w:p>
         </w:tc>
@@ -393,61 +592,102 @@
       <w:tr>
         <w:tc>
           <w:tcPr>
-            <w:tcW w:type="dxa" w:w="2436"/>
-            <w:shd w:val="clear" w:color="auto" w:fill="F2F6FC"/>
+            <w:tcW w:type="dxa" w:w="2160"/>
+            <w:shd w:val="clear" w:color="auto" w:fill="FFFFFF"/>
+            <w:tcBorders>
+              <w:top w:val="single" w:sz="4" w:space="0" w:color="D9D9D9"/>
+              <w:left w:val="single" w:sz="4" w:space="0" w:color="D9D9D9"/>
+              <w:bottom w:val="single" w:sz="4" w:space="0" w:color="D9D9D9"/>
+              <w:right w:val="single" w:sz="4" w:space="0" w:color="D9D9D9"/>
+            </w:tcBorders>
           </w:tcPr>
           <w:p>
+            <w:pPr>
+              <w:jc w:val="left"/>
+            </w:pPr>
             <w:r>
               <w:rPr>
                 <w:rFonts w:ascii="Segoe UI" w:hAnsi="Segoe UI"/>
+                <w:b/>
+                <w:color w:val="1F3864"/>
                 <w:sz w:val="18"/>
               </w:rPr>
-              <w:t>Vegan Precision</w:t>
+              <w:t>Vegan Held-Out F1-Score</w:t>
             </w:r>
           </w:p>
         </w:tc>
         <w:tc>
           <w:tcPr>
-            <w:tcW w:type="dxa" w:w="2436"/>
-            <w:shd w:val="clear" w:color="auto" w:fill="F2F6FC"/>
+            <w:tcW w:type="dxa" w:w="2160"/>
+            <w:shd w:val="clear" w:color="auto" w:fill="FFFFFF"/>
+            <w:tcBorders>
+              <w:top w:val="single" w:sz="4" w:space="0" w:color="D9D9D9"/>
+              <w:left w:val="single" w:sz="4" w:space="0" w:color="D9D9D9"/>
+              <w:bottom w:val="single" w:sz="4" w:space="0" w:color="D9D9D9"/>
+              <w:right w:val="single" w:sz="4" w:space="0" w:color="D9D9D9"/>
+            </w:tcBorders>
           </w:tcPr>
           <w:p>
+            <w:pPr>
+              <w:jc w:val="center"/>
+            </w:pPr>
             <w:r>
               <w:rPr>
                 <w:rFonts w:ascii="Segoe UI" w:hAnsi="Segoe UI"/>
+                <w:color w:val="333333"/>
                 <w:sz w:val="18"/>
               </w:rPr>
-              <w:t>0.90</w:t>
+              <w:t>85.96%</w:t>
             </w:r>
           </w:p>
         </w:tc>
         <w:tc>
           <w:tcPr>
-            <w:tcW w:type="dxa" w:w="2436"/>
-            <w:shd w:val="clear" w:color="auto" w:fill="F2F6FC"/>
+            <w:tcW w:type="dxa" w:w="2160"/>
+            <w:shd w:val="clear" w:color="auto" w:fill="FFFFFF"/>
+            <w:tcBorders>
+              <w:top w:val="single" w:sz="4" w:space="0" w:color="D9D9D9"/>
+              <w:left w:val="single" w:sz="4" w:space="0" w:color="D9D9D9"/>
+              <w:bottom w:val="single" w:sz="4" w:space="0" w:color="D9D9D9"/>
+              <w:right w:val="single" w:sz="4" w:space="0" w:color="D9D9D9"/>
+            </w:tcBorders>
           </w:tcPr>
           <w:p>
+            <w:pPr>
+              <w:jc w:val="center"/>
+            </w:pPr>
             <w:r>
               <w:rPr>
                 <w:rFonts w:ascii="Segoe UI" w:hAnsi="Segoe UI"/>
+                <w:color w:val="333333"/>
                 <w:sz w:val="18"/>
               </w:rPr>
-              <w:t>0.95 (95%)</w:t>
+              <w:t>87.18%</w:t>
             </w:r>
           </w:p>
         </w:tc>
         <w:tc>
           <w:tcPr>
-            <w:tcW w:type="dxa" w:w="2436"/>
-            <w:shd w:val="clear" w:color="auto" w:fill="F2F6FC"/>
+            <w:tcW w:type="dxa" w:w="2160"/>
+            <w:shd w:val="clear" w:color="auto" w:fill="FFFFFF"/>
+            <w:tcBorders>
+              <w:top w:val="single" w:sz="4" w:space="0" w:color="D9D9D9"/>
+              <w:left w:val="single" w:sz="4" w:space="0" w:color="D9D9D9"/>
+              <w:bottom w:val="single" w:sz="4" w:space="0" w:color="D9D9D9"/>
+              <w:right w:val="single" w:sz="4" w:space="0" w:color="D9D9D9"/>
+            </w:tcBorders>
           </w:tcPr>
           <w:p>
+            <w:pPr>
+              <w:jc w:val="center"/>
+            </w:pPr>
             <w:r>
               <w:rPr>
                 <w:rFonts w:ascii="Segoe UI" w:hAnsi="Segoe UI"/>
+                <w:color w:val="333333"/>
                 <w:sz w:val="18"/>
               </w:rPr>
-              <w:t>—</w:t>
+              <w:t>+1.22% (Harmonic precision-recall gain)</w:t>
             </w:r>
           </w:p>
         </w:tc>
@@ -455,61 +695,205 @@
       <w:tr>
         <w:tc>
           <w:tcPr>
-            <w:tcW w:type="dxa" w:w="2436"/>
-            <w:shd w:val="clear" w:color="auto" w:fill="FFFFFF"/>
+            <w:tcW w:type="dxa" w:w="2160"/>
+            <w:shd w:val="clear" w:color="auto" w:fill="F2F6FC"/>
+            <w:tcBorders>
+              <w:top w:val="single" w:sz="4" w:space="0" w:color="D9D9D9"/>
+              <w:left w:val="single" w:sz="4" w:space="0" w:color="D9D9D9"/>
+              <w:bottom w:val="single" w:sz="4" w:space="0" w:color="D9D9D9"/>
+              <w:right w:val="single" w:sz="4" w:space="0" w:color="D9D9D9"/>
+            </w:tcBorders>
           </w:tcPr>
           <w:p>
+            <w:pPr>
+              <w:jc w:val="left"/>
+            </w:pPr>
             <w:r>
               <w:rPr>
                 <w:rFonts w:ascii="Segoe UI" w:hAnsi="Segoe UI"/>
+                <w:b/>
+                <w:color w:val="1F3864"/>
                 <w:sz w:val="18"/>
               </w:rPr>
-              <w:t>Vegetarian Recall</w:t>
+              <w:t>Vegetarian Precision</w:t>
             </w:r>
           </w:p>
         </w:tc>
         <w:tc>
           <w:tcPr>
-            <w:tcW w:type="dxa" w:w="2436"/>
-            <w:shd w:val="clear" w:color="auto" w:fill="FFFFFF"/>
+            <w:tcW w:type="dxa" w:w="2160"/>
+            <w:shd w:val="clear" w:color="auto" w:fill="F2F6FC"/>
+            <w:tcBorders>
+              <w:top w:val="single" w:sz="4" w:space="0" w:color="D9D9D9"/>
+              <w:left w:val="single" w:sz="4" w:space="0" w:color="D9D9D9"/>
+              <w:bottom w:val="single" w:sz="4" w:space="0" w:color="D9D9D9"/>
+              <w:right w:val="single" w:sz="4" w:space="0" w:color="D9D9D9"/>
+            </w:tcBorders>
           </w:tcPr>
           <w:p>
+            <w:pPr>
+              <w:jc w:val="center"/>
+            </w:pPr>
             <w:r>
               <w:rPr>
                 <w:rFonts w:ascii="Segoe UI" w:hAnsi="Segoe UI"/>
+                <w:color w:val="333333"/>
                 <w:sz w:val="18"/>
               </w:rPr>
-              <w:t>0.87</w:t>
+              <w:t>76.36%</w:t>
             </w:r>
           </w:p>
         </w:tc>
         <w:tc>
           <w:tcPr>
-            <w:tcW w:type="dxa" w:w="2436"/>
-            <w:shd w:val="clear" w:color="auto" w:fill="FFFFFF"/>
+            <w:tcW w:type="dxa" w:w="2160"/>
+            <w:shd w:val="clear" w:color="auto" w:fill="F2F6FC"/>
+            <w:tcBorders>
+              <w:top w:val="single" w:sz="4" w:space="0" w:color="D9D9D9"/>
+              <w:left w:val="single" w:sz="4" w:space="0" w:color="D9D9D9"/>
+              <w:bottom w:val="single" w:sz="4" w:space="0" w:color="D9D9D9"/>
+              <w:right w:val="single" w:sz="4" w:space="0" w:color="D9D9D9"/>
+            </w:tcBorders>
           </w:tcPr>
           <w:p>
+            <w:pPr>
+              <w:jc w:val="center"/>
+            </w:pPr>
             <w:r>
               <w:rPr>
                 <w:rFonts w:ascii="Segoe UI" w:hAnsi="Segoe UI"/>
+                <w:color w:val="333333"/>
                 <w:sz w:val="18"/>
               </w:rPr>
-              <w:t>0.93 (93%)</w:t>
+              <w:t>79.17%</w:t>
             </w:r>
           </w:p>
         </w:tc>
         <w:tc>
           <w:tcPr>
-            <w:tcW w:type="dxa" w:w="2436"/>
-            <w:shd w:val="clear" w:color="auto" w:fill="FFFFFF"/>
+            <w:tcW w:type="dxa" w:w="2160"/>
+            <w:shd w:val="clear" w:color="auto" w:fill="F2F6FC"/>
+            <w:tcBorders>
+              <w:top w:val="single" w:sz="4" w:space="0" w:color="D9D9D9"/>
+              <w:left w:val="single" w:sz="4" w:space="0" w:color="D9D9D9"/>
+              <w:bottom w:val="single" w:sz="4" w:space="0" w:color="D9D9D9"/>
+              <w:right w:val="single" w:sz="4" w:space="0" w:color="D9D9D9"/>
+            </w:tcBorders>
           </w:tcPr>
           <w:p>
+            <w:pPr>
+              <w:jc w:val="center"/>
+            </w:pPr>
             <w:r>
               <w:rPr>
                 <w:rFonts w:ascii="Segoe UI" w:hAnsi="Segoe UI"/>
+                <w:color w:val="333333"/>
                 <w:sz w:val="18"/>
               </w:rPr>
-              <w:t>—</w:t>
+              <w:t>+2.81% (Higher purity on dairy detections)</w:t>
+            </w:r>
+          </w:p>
+        </w:tc>
+      </w:tr>
+      <w:tr>
+        <w:tc>
+          <w:tcPr>
+            <w:tcW w:type="dxa" w:w="2160"/>
+            <w:shd w:val="clear" w:color="auto" w:fill="FFFFFF"/>
+            <w:tcBorders>
+              <w:top w:val="single" w:sz="4" w:space="0" w:color="D9D9D9"/>
+              <w:left w:val="single" w:sz="4" w:space="0" w:color="D9D9D9"/>
+              <w:bottom w:val="single" w:sz="4" w:space="0" w:color="D9D9D9"/>
+              <w:right w:val="single" w:sz="4" w:space="0" w:color="D9D9D9"/>
+            </w:tcBorders>
+          </w:tcPr>
+          <w:p>
+            <w:pPr>
+              <w:jc w:val="left"/>
+            </w:pPr>
+            <w:r>
+              <w:rPr>
+                <w:rFonts w:ascii="Segoe UI" w:hAnsi="Segoe UI"/>
+                <w:b/>
+                <w:color w:val="1F3864"/>
+                <w:sz w:val="18"/>
+              </w:rPr>
+              <w:t>Excluded Meat Categories</w:t>
+            </w:r>
+          </w:p>
+        </w:tc>
+        <w:tc>
+          <w:tcPr>
+            <w:tcW w:type="dxa" w:w="2160"/>
+            <w:shd w:val="clear" w:color="auto" w:fill="FFFFFF"/>
+            <w:tcBorders>
+              <w:top w:val="single" w:sz="4" w:space="0" w:color="D9D9D9"/>
+              <w:left w:val="single" w:sz="4" w:space="0" w:color="D9D9D9"/>
+              <w:bottom w:val="single" w:sz="4" w:space="0" w:color="D9D9D9"/>
+              <w:right w:val="single" w:sz="4" w:space="0" w:color="D9D9D9"/>
+            </w:tcBorders>
+          </w:tcPr>
+          <w:p>
+            <w:pPr>
+              <w:jc w:val="center"/>
+            </w:pPr>
+            <w:r>
+              <w:rPr>
+                <w:rFonts w:ascii="Segoe UI" w:hAnsi="Segoe UI"/>
+                <w:color w:val="333333"/>
+                <w:sz w:val="18"/>
+              </w:rPr>
+              <w:t>10 Dishes (0 imgs)</w:t>
+            </w:r>
+          </w:p>
+        </w:tc>
+        <w:tc>
+          <w:tcPr>
+            <w:tcW w:type="dxa" w:w="2160"/>
+            <w:shd w:val="clear" w:color="auto" w:fill="FFFFFF"/>
+            <w:tcBorders>
+              <w:top w:val="single" w:sz="4" w:space="0" w:color="D9D9D9"/>
+              <w:left w:val="single" w:sz="4" w:space="0" w:color="D9D9D9"/>
+              <w:bottom w:val="single" w:sz="4" w:space="0" w:color="D9D9D9"/>
+              <w:right w:val="single" w:sz="4" w:space="0" w:color="D9D9D9"/>
+            </w:tcBorders>
+          </w:tcPr>
+          <w:p>
+            <w:pPr>
+              <w:jc w:val="center"/>
+            </w:pPr>
+            <w:r>
+              <w:rPr>
+                <w:rFonts w:ascii="Segoe UI" w:hAnsi="Segoe UI"/>
+                <w:color w:val="333333"/>
+                <w:sz w:val="18"/>
+              </w:rPr>
+              <w:t>10 Dishes (0 imgs)</w:t>
+            </w:r>
+          </w:p>
+        </w:tc>
+        <w:tc>
+          <w:tcPr>
+            <w:tcW w:type="dxa" w:w="2160"/>
+            <w:shd w:val="clear" w:color="auto" w:fill="FFFFFF"/>
+            <w:tcBorders>
+              <w:top w:val="single" w:sz="4" w:space="0" w:color="D9D9D9"/>
+              <w:left w:val="single" w:sz="4" w:space="0" w:color="D9D9D9"/>
+              <w:bottom w:val="single" w:sz="4" w:space="0" w:color="D9D9D9"/>
+              <w:right w:val="single" w:sz="4" w:space="0" w:color="D9D9D9"/>
+            </w:tcBorders>
+          </w:tcPr>
+          <w:p>
+            <w:pPr>
+              <w:jc w:val="center"/>
+            </w:pPr>
+            <w:r>
+              <w:rPr>
+                <w:rFonts w:ascii="Segoe UI" w:hAnsi="Segoe UI"/>
+                <w:color w:val="333333"/>
+                <w:sz w:val="18"/>
+              </w:rPr>
+              <w:t>Strictly 0 meat/fish images in dataset</w:t>
             </w:r>
           </w:p>
         </w:tc>
@@ -526,41 +910,51 @@
           <w:rFonts w:ascii="Segoe UI" w:hAnsi="Segoe UI"/>
           <w:color w:val="1F3864"/>
         </w:rPr>
-        <w:t>2. Meat-Free Dataset Cohort (15 Dishes, 704 Images)</w:t>
+        <w:t>2. Meat-Free Dataset Cohort (15 Dishes, 703 Images)</w:t>
       </w:r>
     </w:p>
     <w:p>
+      <w:pPr>
+        <w:spacing w:line="276" w:lineRule="auto" w:after="120"/>
+      </w:pPr>
       <w:r>
         <w:rPr>
           <w:rFonts w:ascii="Segoe UI" w:hAnsi="Segoe UI"/>
-          <w:b w:val="0"/>
-          <w:i w:val="0"/>
-          <w:color w:val="262626"/>
+          <w:color w:val="333333"/>
           <w:sz w:val="20"/>
         </w:rPr>
-        <w:t>All meat, poultry, fish, and seafood dishes (Mixed Grill, Shawarma, Shish Tawook, Grilled Kofta, Meat Maqluba, Meat Pie, Kofta Stew, Shrimp Sayadiyah, Stuffed Pigeon, and Meat Madfoon) were strictly excluded. The model evaluates exclusively on the 15 meatless dishes in the dataset:</w:t>
+        <w:t>All 10 meat, poultry, fish, and seafood dishes (Mixed Grill, Shawarma, Shish Tawook, Grilled Kofta, Meat Maqluba, Meat Pie, Kofta Stew, Shrimp Sayadiyah, Stuffed Pigeon, and Meat Madfoon) were strictly excluded. The cohort consists exclusively of the 15 meatless dishes in the dataset:</w:t>
       </w:r>
     </w:p>
     <w:tbl>
       <w:tblPr>
-        <w:tblStyle w:val="TableGrid"/>
         <w:tblW w:type="auto" w:w="0"/>
         <w:jc w:val="center"/>
+        <w:tblLayout w:type="fixed"/>
         <w:tblLook w:firstColumn="1" w:firstRow="1" w:lastColumn="0" w:lastRow="0" w:noHBand="0" w:noVBand="1" w:val="04A0"/>
       </w:tblPr>
       <w:tblGrid>
-        <w:gridCol w:w="2436"/>
-        <w:gridCol w:w="2436"/>
-        <w:gridCol w:w="2436"/>
-        <w:gridCol w:w="2436"/>
+        <w:gridCol w:w="2160"/>
+        <w:gridCol w:w="2160"/>
+        <w:gridCol w:w="2160"/>
+        <w:gridCol w:w="2160"/>
       </w:tblGrid>
       <w:tr>
         <w:tc>
           <w:tcPr>
-            <w:tcW w:type="dxa" w:w="2436"/>
+            <w:tcW w:type="dxa" w:w="2160"/>
             <w:shd w:val="clear" w:color="auto" w:fill="1F3864"/>
+            <w:tcBorders>
+              <w:top w:val="single" w:sz="4" w:space="0" w:color="D9D9D9"/>
+              <w:left w:val="single" w:sz="4" w:space="0" w:color="D9D9D9"/>
+              <w:bottom w:val="single" w:sz="4" w:space="0" w:color="D9D9D9"/>
+              <w:right w:val="single" w:sz="4" w:space="0" w:color="D9D9D9"/>
+            </w:tcBorders>
           </w:tcPr>
           <w:p>
+            <w:pPr>
+              <w:jc w:val="center"/>
+            </w:pPr>
             <w:r>
               <w:rPr>
                 <w:rFonts w:ascii="Segoe UI" w:hAnsi="Segoe UI"/>
@@ -574,10 +968,19 @@
         </w:tc>
         <w:tc>
           <w:tcPr>
-            <w:tcW w:type="dxa" w:w="2436"/>
+            <w:tcW w:type="dxa" w:w="2160"/>
             <w:shd w:val="clear" w:color="auto" w:fill="1F3864"/>
+            <w:tcBorders>
+              <w:top w:val="single" w:sz="4" w:space="0" w:color="D9D9D9"/>
+              <w:left w:val="single" w:sz="4" w:space="0" w:color="D9D9D9"/>
+              <w:bottom w:val="single" w:sz="4" w:space="0" w:color="D9D9D9"/>
+              <w:right w:val="single" w:sz="4" w:space="0" w:color="D9D9D9"/>
+            </w:tcBorders>
           </w:tcPr>
           <w:p>
+            <w:pPr>
+              <w:jc w:val="center"/>
+            </w:pPr>
             <w:r>
               <w:rPr>
                 <w:rFonts w:ascii="Segoe UI" w:hAnsi="Segoe UI"/>
@@ -591,10 +994,19 @@
         </w:tc>
         <w:tc>
           <w:tcPr>
-            <w:tcW w:type="dxa" w:w="2436"/>
+            <w:tcW w:type="dxa" w:w="2160"/>
             <w:shd w:val="clear" w:color="auto" w:fill="1F3864"/>
+            <w:tcBorders>
+              <w:top w:val="single" w:sz="4" w:space="0" w:color="D9D9D9"/>
+              <w:left w:val="single" w:sz="4" w:space="0" w:color="D9D9D9"/>
+              <w:bottom w:val="single" w:sz="4" w:space="0" w:color="D9D9D9"/>
+              <w:right w:val="single" w:sz="4" w:space="0" w:color="D9D9D9"/>
+            </w:tcBorders>
           </w:tcPr>
           <w:p>
+            <w:pPr>
+              <w:jc w:val="center"/>
+            </w:pPr>
             <w:r>
               <w:rPr>
                 <w:rFonts w:ascii="Segoe UI" w:hAnsi="Segoe UI"/>
@@ -608,10 +1020,19 @@
         </w:tc>
         <w:tc>
           <w:tcPr>
-            <w:tcW w:type="dxa" w:w="2436"/>
+            <w:tcW w:type="dxa" w:w="2160"/>
             <w:shd w:val="clear" w:color="auto" w:fill="1F3864"/>
+            <w:tcBorders>
+              <w:top w:val="single" w:sz="4" w:space="0" w:color="D9D9D9"/>
+              <w:left w:val="single" w:sz="4" w:space="0" w:color="D9D9D9"/>
+              <w:bottom w:val="single" w:sz="4" w:space="0" w:color="D9D9D9"/>
+              <w:right w:val="single" w:sz="4" w:space="0" w:color="D9D9D9"/>
+            </w:tcBorders>
           </w:tcPr>
           <w:p>
+            <w:pPr>
+              <w:jc w:val="center"/>
+            </w:pPr>
             <w:r>
               <w:rPr>
                 <w:rFonts w:ascii="Segoe UI" w:hAnsi="Segoe UI"/>
@@ -627,13 +1048,24 @@
       <w:tr>
         <w:tc>
           <w:tcPr>
-            <w:tcW w:type="dxa" w:w="2436"/>
-            <w:shd w:val="clear" w:color="auto" w:fill="F2F6FC"/>
+            <w:tcW w:type="dxa" w:w="2160"/>
+            <w:shd w:val="clear" w:color="auto" w:fill="FFFFFF"/>
+            <w:tcBorders>
+              <w:top w:val="single" w:sz="4" w:space="0" w:color="D9D9D9"/>
+              <w:left w:val="single" w:sz="4" w:space="0" w:color="D9D9D9"/>
+              <w:bottom w:val="single" w:sz="4" w:space="0" w:color="D9D9D9"/>
+              <w:right w:val="single" w:sz="4" w:space="0" w:color="D9D9D9"/>
+            </w:tcBorders>
           </w:tcPr>
           <w:p>
+            <w:pPr>
+              <w:jc w:val="left"/>
+            </w:pPr>
             <w:r>
               <w:rPr>
                 <w:rFonts w:ascii="Segoe UI" w:hAnsi="Segoe UI"/>
+                <w:b/>
+                <w:color w:val="1F3864"/>
                 <w:sz w:val="18"/>
               </w:rPr>
               <w:t>Hummus</w:t>
@@ -642,13 +1074,23 @@
         </w:tc>
         <w:tc>
           <w:tcPr>
-            <w:tcW w:type="dxa" w:w="2436"/>
-            <w:shd w:val="clear" w:color="auto" w:fill="F2F6FC"/>
+            <w:tcW w:type="dxa" w:w="2160"/>
+            <w:shd w:val="clear" w:color="auto" w:fill="FFFFFF"/>
+            <w:tcBorders>
+              <w:top w:val="single" w:sz="4" w:space="0" w:color="D9D9D9"/>
+              <w:left w:val="single" w:sz="4" w:space="0" w:color="D9D9D9"/>
+              <w:bottom w:val="single" w:sz="4" w:space="0" w:color="D9D9D9"/>
+              <w:right w:val="single" w:sz="4" w:space="0" w:color="D9D9D9"/>
+            </w:tcBorders>
           </w:tcPr>
           <w:p>
+            <w:pPr>
+              <w:jc w:val="center"/>
+            </w:pPr>
             <w:r>
               <w:rPr>
                 <w:rFonts w:ascii="Segoe UI" w:hAnsi="Segoe UI"/>
+                <w:color w:val="333333"/>
                 <w:sz w:val="18"/>
               </w:rPr>
               <w:t>Vegan</w:t>
@@ -657,13 +1099,23 @@
         </w:tc>
         <w:tc>
           <w:tcPr>
-            <w:tcW w:type="dxa" w:w="2436"/>
-            <w:shd w:val="clear" w:color="auto" w:fill="F2F6FC"/>
+            <w:tcW w:type="dxa" w:w="2160"/>
+            <w:shd w:val="clear" w:color="auto" w:fill="FFFFFF"/>
+            <w:tcBorders>
+              <w:top w:val="single" w:sz="4" w:space="0" w:color="D9D9D9"/>
+              <w:left w:val="single" w:sz="4" w:space="0" w:color="D9D9D9"/>
+              <w:bottom w:val="single" w:sz="4" w:space="0" w:color="D9D9D9"/>
+              <w:right w:val="single" w:sz="4" w:space="0" w:color="D9D9D9"/>
+            </w:tcBorders>
           </w:tcPr>
           <w:p>
+            <w:pPr>
+              <w:jc w:val="center"/>
+            </w:pPr>
             <w:r>
               <w:rPr>
                 <w:rFonts w:ascii="Segoe UI" w:hAnsi="Segoe UI"/>
+                <w:color w:val="333333"/>
                 <w:sz w:val="18"/>
               </w:rPr>
               <w:t>61</w:t>
@@ -672,13 +1124,23 @@
         </w:tc>
         <w:tc>
           <w:tcPr>
-            <w:tcW w:type="dxa" w:w="2436"/>
-            <w:shd w:val="clear" w:color="auto" w:fill="F2F6FC"/>
+            <w:tcW w:type="dxa" w:w="2160"/>
+            <w:shd w:val="clear" w:color="auto" w:fill="FFFFFF"/>
+            <w:tcBorders>
+              <w:top w:val="single" w:sz="4" w:space="0" w:color="D9D9D9"/>
+              <w:left w:val="single" w:sz="4" w:space="0" w:color="D9D9D9"/>
+              <w:bottom w:val="single" w:sz="4" w:space="0" w:color="D9D9D9"/>
+              <w:right w:val="single" w:sz="4" w:space="0" w:color="D9D9D9"/>
+            </w:tcBorders>
           </w:tcPr>
           <w:p>
+            <w:pPr>
+              <w:jc w:val="center"/>
+            </w:pPr>
             <w:r>
               <w:rPr>
                 <w:rFonts w:ascii="Segoe UI" w:hAnsi="Segoe UI"/>
+                <w:color w:val="333333"/>
                 <w:sz w:val="18"/>
               </w:rPr>
               <w:t>Chickpeas, tahini (sesame paste), olive oil, garlic. Naturally 100% plant-based.</w:t>
@@ -689,13 +1151,24 @@
       <w:tr>
         <w:tc>
           <w:tcPr>
-            <w:tcW w:type="dxa" w:w="2436"/>
-            <w:shd w:val="clear" w:color="auto" w:fill="FFFFFF"/>
+            <w:tcW w:type="dxa" w:w="2160"/>
+            <w:shd w:val="clear" w:color="auto" w:fill="F2F6FC"/>
+            <w:tcBorders>
+              <w:top w:val="single" w:sz="4" w:space="0" w:color="D9D9D9"/>
+              <w:left w:val="single" w:sz="4" w:space="0" w:color="D9D9D9"/>
+              <w:bottom w:val="single" w:sz="4" w:space="0" w:color="D9D9D9"/>
+              <w:right w:val="single" w:sz="4" w:space="0" w:color="D9D9D9"/>
+            </w:tcBorders>
           </w:tcPr>
           <w:p>
+            <w:pPr>
+              <w:jc w:val="left"/>
+            </w:pPr>
             <w:r>
               <w:rPr>
                 <w:rFonts w:ascii="Segoe UI" w:hAnsi="Segoe UI"/>
+                <w:b/>
+                <w:color w:val="1F3864"/>
                 <w:sz w:val="18"/>
               </w:rPr>
               <w:t>Tamees Bread</w:t>
@@ -704,13 +1177,23 @@
         </w:tc>
         <w:tc>
           <w:tcPr>
-            <w:tcW w:type="dxa" w:w="2436"/>
-            <w:shd w:val="clear" w:color="auto" w:fill="FFFFFF"/>
+            <w:tcW w:type="dxa" w:w="2160"/>
+            <w:shd w:val="clear" w:color="auto" w:fill="F2F6FC"/>
+            <w:tcBorders>
+              <w:top w:val="single" w:sz="4" w:space="0" w:color="D9D9D9"/>
+              <w:left w:val="single" w:sz="4" w:space="0" w:color="D9D9D9"/>
+              <w:bottom w:val="single" w:sz="4" w:space="0" w:color="D9D9D9"/>
+              <w:right w:val="single" w:sz="4" w:space="0" w:color="D9D9D9"/>
+            </w:tcBorders>
           </w:tcPr>
           <w:p>
+            <w:pPr>
+              <w:jc w:val="center"/>
+            </w:pPr>
             <w:r>
               <w:rPr>
                 <w:rFonts w:ascii="Segoe UI" w:hAnsi="Segoe UI"/>
+                <w:color w:val="333333"/>
                 <w:sz w:val="18"/>
               </w:rPr>
               <w:t>Vegan</w:t>
@@ -719,13 +1202,23 @@
         </w:tc>
         <w:tc>
           <w:tcPr>
-            <w:tcW w:type="dxa" w:w="2436"/>
-            <w:shd w:val="clear" w:color="auto" w:fill="FFFFFF"/>
+            <w:tcW w:type="dxa" w:w="2160"/>
+            <w:shd w:val="clear" w:color="auto" w:fill="F2F6FC"/>
+            <w:tcBorders>
+              <w:top w:val="single" w:sz="4" w:space="0" w:color="D9D9D9"/>
+              <w:left w:val="single" w:sz="4" w:space="0" w:color="D9D9D9"/>
+              <w:bottom w:val="single" w:sz="4" w:space="0" w:color="D9D9D9"/>
+              <w:right w:val="single" w:sz="4" w:space="0" w:color="D9D9D9"/>
+            </w:tcBorders>
           </w:tcPr>
           <w:p>
+            <w:pPr>
+              <w:jc w:val="center"/>
+            </w:pPr>
             <w:r>
               <w:rPr>
                 <w:rFonts w:ascii="Segoe UI" w:hAnsi="Segoe UI"/>
+                <w:color w:val="333333"/>
                 <w:sz w:val="18"/>
               </w:rPr>
               <w:t>53</w:t>
@@ -734,13 +1227,23 @@
         </w:tc>
         <w:tc>
           <w:tcPr>
-            <w:tcW w:type="dxa" w:w="2436"/>
-            <w:shd w:val="clear" w:color="auto" w:fill="FFFFFF"/>
+            <w:tcW w:type="dxa" w:w="2160"/>
+            <w:shd w:val="clear" w:color="auto" w:fill="F2F6FC"/>
+            <w:tcBorders>
+              <w:top w:val="single" w:sz="4" w:space="0" w:color="D9D9D9"/>
+              <w:left w:val="single" w:sz="4" w:space="0" w:color="D9D9D9"/>
+              <w:bottom w:val="single" w:sz="4" w:space="0" w:color="D9D9D9"/>
+              <w:right w:val="single" w:sz="4" w:space="0" w:color="D9D9D9"/>
+            </w:tcBorders>
           </w:tcPr>
           <w:p>
+            <w:pPr>
+              <w:jc w:val="center"/>
+            </w:pPr>
             <w:r>
               <w:rPr>
                 <w:rFonts w:ascii="Segoe UI" w:hAnsi="Segoe UI"/>
+                <w:color w:val="333333"/>
                 <w:sz w:val="18"/>
               </w:rPr>
               <w:t>Plain Saudi tandoor wheat bread: Flour, water, yeast, salt, vegetable oil.</w:t>
@@ -751,13 +1254,24 @@
       <w:tr>
         <w:tc>
           <w:tcPr>
-            <w:tcW w:type="dxa" w:w="2436"/>
-            <w:shd w:val="clear" w:color="auto" w:fill="F2F6FC"/>
+            <w:tcW w:type="dxa" w:w="2160"/>
+            <w:shd w:val="clear" w:color="auto" w:fill="FFFFFF"/>
+            <w:tcBorders>
+              <w:top w:val="single" w:sz="4" w:space="0" w:color="D9D9D9"/>
+              <w:left w:val="single" w:sz="4" w:space="0" w:color="D9D9D9"/>
+              <w:bottom w:val="single" w:sz="4" w:space="0" w:color="D9D9D9"/>
+              <w:right w:val="single" w:sz="4" w:space="0" w:color="D9D9D9"/>
+            </w:tcBorders>
           </w:tcPr>
           <w:p>
+            <w:pPr>
+              <w:jc w:val="left"/>
+            </w:pPr>
             <w:r>
               <w:rPr>
                 <w:rFonts w:ascii="Segoe UI" w:hAnsi="Segoe UI"/>
+                <w:b/>
+                <w:color w:val="1F3864"/>
                 <w:sz w:val="18"/>
               </w:rPr>
               <w:t>Za’atar Manakish</w:t>
@@ -766,13 +1280,23 @@
         </w:tc>
         <w:tc>
           <w:tcPr>
-            <w:tcW w:type="dxa" w:w="2436"/>
-            <w:shd w:val="clear" w:color="auto" w:fill="F2F6FC"/>
+            <w:tcW w:type="dxa" w:w="2160"/>
+            <w:shd w:val="clear" w:color="auto" w:fill="FFFFFF"/>
+            <w:tcBorders>
+              <w:top w:val="single" w:sz="4" w:space="0" w:color="D9D9D9"/>
+              <w:left w:val="single" w:sz="4" w:space="0" w:color="D9D9D9"/>
+              <w:bottom w:val="single" w:sz="4" w:space="0" w:color="D9D9D9"/>
+              <w:right w:val="single" w:sz="4" w:space="0" w:color="D9D9D9"/>
+            </w:tcBorders>
           </w:tcPr>
           <w:p>
+            <w:pPr>
+              <w:jc w:val="center"/>
+            </w:pPr>
             <w:r>
               <w:rPr>
                 <w:rFonts w:ascii="Segoe UI" w:hAnsi="Segoe UI"/>
+                <w:color w:val="333333"/>
                 <w:sz w:val="18"/>
               </w:rPr>
               <w:t>Vegan</w:t>
@@ -781,13 +1305,23 @@
         </w:tc>
         <w:tc>
           <w:tcPr>
-            <w:tcW w:type="dxa" w:w="2436"/>
-            <w:shd w:val="clear" w:color="auto" w:fill="F2F6FC"/>
+            <w:tcW w:type="dxa" w:w="2160"/>
+            <w:shd w:val="clear" w:color="auto" w:fill="FFFFFF"/>
+            <w:tcBorders>
+              <w:top w:val="single" w:sz="4" w:space="0" w:color="D9D9D9"/>
+              <w:left w:val="single" w:sz="4" w:space="0" w:color="D9D9D9"/>
+              <w:bottom w:val="single" w:sz="4" w:space="0" w:color="D9D9D9"/>
+              <w:right w:val="single" w:sz="4" w:space="0" w:color="D9D9D9"/>
+            </w:tcBorders>
           </w:tcPr>
           <w:p>
+            <w:pPr>
+              <w:jc w:val="center"/>
+            </w:pPr>
             <w:r>
               <w:rPr>
                 <w:rFonts w:ascii="Segoe UI" w:hAnsi="Segoe UI"/>
+                <w:color w:val="333333"/>
                 <w:sz w:val="18"/>
               </w:rPr>
               <w:t>52</w:t>
@@ -796,13 +1330,23 @@
         </w:tc>
         <w:tc>
           <w:tcPr>
-            <w:tcW w:type="dxa" w:w="2436"/>
-            <w:shd w:val="clear" w:color="auto" w:fill="F2F6FC"/>
+            <w:tcW w:type="dxa" w:w="2160"/>
+            <w:shd w:val="clear" w:color="auto" w:fill="FFFFFF"/>
+            <w:tcBorders>
+              <w:top w:val="single" w:sz="4" w:space="0" w:color="D9D9D9"/>
+              <w:left w:val="single" w:sz="4" w:space="0" w:color="D9D9D9"/>
+              <w:bottom w:val="single" w:sz="4" w:space="0" w:color="D9D9D9"/>
+              <w:right w:val="single" w:sz="4" w:space="0" w:color="D9D9D9"/>
+            </w:tcBorders>
           </w:tcPr>
           <w:p>
+            <w:pPr>
+              <w:jc w:val="center"/>
+            </w:pPr>
             <w:r>
               <w:rPr>
                 <w:rFonts w:ascii="Segoe UI" w:hAnsi="Segoe UI"/>
+                <w:color w:val="333333"/>
                 <w:sz w:val="18"/>
               </w:rPr>
               <w:t>Flatbread dough topped with wild thyme, sumac, sesame seeds, and extra virgin olive oil.</w:t>
@@ -813,13 +1357,24 @@
       <w:tr>
         <w:tc>
           <w:tcPr>
-            <w:tcW w:type="dxa" w:w="2436"/>
-            <w:shd w:val="clear" w:color="auto" w:fill="FFFFFF"/>
+            <w:tcW w:type="dxa" w:w="2160"/>
+            <w:shd w:val="clear" w:color="auto" w:fill="F2F6FC"/>
+            <w:tcBorders>
+              <w:top w:val="single" w:sz="4" w:space="0" w:color="D9D9D9"/>
+              <w:left w:val="single" w:sz="4" w:space="0" w:color="D9D9D9"/>
+              <w:bottom w:val="single" w:sz="4" w:space="0" w:color="D9D9D9"/>
+              <w:right w:val="single" w:sz="4" w:space="0" w:color="D9D9D9"/>
+            </w:tcBorders>
           </w:tcPr>
           <w:p>
+            <w:pPr>
+              <w:jc w:val="left"/>
+            </w:pPr>
             <w:r>
               <w:rPr>
                 <w:rFonts w:ascii="Segoe UI" w:hAnsi="Segoe UI"/>
+                <w:b/>
+                <w:color w:val="1F3864"/>
                 <w:sz w:val="18"/>
               </w:rPr>
               <w:t>Okra Tagine</w:t>
@@ -828,13 +1383,23 @@
         </w:tc>
         <w:tc>
           <w:tcPr>
-            <w:tcW w:type="dxa" w:w="2436"/>
-            <w:shd w:val="clear" w:color="auto" w:fill="FFFFFF"/>
+            <w:tcW w:type="dxa" w:w="2160"/>
+            <w:shd w:val="clear" w:color="auto" w:fill="F2F6FC"/>
+            <w:tcBorders>
+              <w:top w:val="single" w:sz="4" w:space="0" w:color="D9D9D9"/>
+              <w:left w:val="single" w:sz="4" w:space="0" w:color="D9D9D9"/>
+              <w:bottom w:val="single" w:sz="4" w:space="0" w:color="D9D9D9"/>
+              <w:right w:val="single" w:sz="4" w:space="0" w:color="D9D9D9"/>
+            </w:tcBorders>
           </w:tcPr>
           <w:p>
+            <w:pPr>
+              <w:jc w:val="center"/>
+            </w:pPr>
             <w:r>
               <w:rPr>
                 <w:rFonts w:ascii="Segoe UI" w:hAnsi="Segoe UI"/>
+                <w:color w:val="333333"/>
                 <w:sz w:val="18"/>
               </w:rPr>
               <w:t>Vegan</w:t>
@@ -843,13 +1408,23 @@
         </w:tc>
         <w:tc>
           <w:tcPr>
-            <w:tcW w:type="dxa" w:w="2436"/>
-            <w:shd w:val="clear" w:color="auto" w:fill="FFFFFF"/>
+            <w:tcW w:type="dxa" w:w="2160"/>
+            <w:shd w:val="clear" w:color="auto" w:fill="F2F6FC"/>
+            <w:tcBorders>
+              <w:top w:val="single" w:sz="4" w:space="0" w:color="D9D9D9"/>
+              <w:left w:val="single" w:sz="4" w:space="0" w:color="D9D9D9"/>
+              <w:bottom w:val="single" w:sz="4" w:space="0" w:color="D9D9D9"/>
+              <w:right w:val="single" w:sz="4" w:space="0" w:color="D9D9D9"/>
+            </w:tcBorders>
           </w:tcPr>
           <w:p>
+            <w:pPr>
+              <w:jc w:val="center"/>
+            </w:pPr>
             <w:r>
               <w:rPr>
                 <w:rFonts w:ascii="Segoe UI" w:hAnsi="Segoe UI"/>
+                <w:color w:val="333333"/>
                 <w:sz w:val="18"/>
               </w:rPr>
               <w:t>45</w:t>
@@ -858,13 +1433,23 @@
         </w:tc>
         <w:tc>
           <w:tcPr>
-            <w:tcW w:type="dxa" w:w="2436"/>
-            <w:shd w:val="clear" w:color="auto" w:fill="FFFFFF"/>
+            <w:tcW w:type="dxa" w:w="2160"/>
+            <w:shd w:val="clear" w:color="auto" w:fill="F2F6FC"/>
+            <w:tcBorders>
+              <w:top w:val="single" w:sz="4" w:space="0" w:color="D9D9D9"/>
+              <w:left w:val="single" w:sz="4" w:space="0" w:color="D9D9D9"/>
+              <w:bottom w:val="single" w:sz="4" w:space="0" w:color="D9D9D9"/>
+              <w:right w:val="single" w:sz="4" w:space="0" w:color="D9D9D9"/>
+            </w:tcBorders>
           </w:tcPr>
           <w:p>
+            <w:pPr>
+              <w:jc w:val="center"/>
+            </w:pPr>
             <w:r>
               <w:rPr>
                 <w:rFonts w:ascii="Segoe UI" w:hAnsi="Segoe UI"/>
+                <w:color w:val="333333"/>
                 <w:sz w:val="18"/>
               </w:rPr>
               <w:t>Bamya bil-Zayt: Baby okra pods simmered in tomato gravy, cilantro, garlic, olive oil.</w:t>
@@ -875,13 +1460,24 @@
       <w:tr>
         <w:tc>
           <w:tcPr>
-            <w:tcW w:type="dxa" w:w="2436"/>
-            <w:shd w:val="clear" w:color="auto" w:fill="F2F6FC"/>
+            <w:tcW w:type="dxa" w:w="2160"/>
+            <w:shd w:val="clear" w:color="auto" w:fill="FFFFFF"/>
+            <w:tcBorders>
+              <w:top w:val="single" w:sz="4" w:space="0" w:color="D9D9D9"/>
+              <w:left w:val="single" w:sz="4" w:space="0" w:color="D9D9D9"/>
+              <w:bottom w:val="single" w:sz="4" w:space="0" w:color="D9D9D9"/>
+              <w:right w:val="single" w:sz="4" w:space="0" w:color="D9D9D9"/>
+            </w:tcBorders>
           </w:tcPr>
           <w:p>
+            <w:pPr>
+              <w:jc w:val="left"/>
+            </w:pPr>
             <w:r>
               <w:rPr>
                 <w:rFonts w:ascii="Segoe UI" w:hAnsi="Segoe UI"/>
+                <w:b/>
+                <w:color w:val="1F3864"/>
                 <w:sz w:val="18"/>
               </w:rPr>
               <w:t>Sesame Brittle</w:t>
@@ -890,13 +1486,23 @@
         </w:tc>
         <w:tc>
           <w:tcPr>
-            <w:tcW w:type="dxa" w:w="2436"/>
-            <w:shd w:val="clear" w:color="auto" w:fill="F2F6FC"/>
+            <w:tcW w:type="dxa" w:w="2160"/>
+            <w:shd w:val="clear" w:color="auto" w:fill="FFFFFF"/>
+            <w:tcBorders>
+              <w:top w:val="single" w:sz="4" w:space="0" w:color="D9D9D9"/>
+              <w:left w:val="single" w:sz="4" w:space="0" w:color="D9D9D9"/>
+              <w:bottom w:val="single" w:sz="4" w:space="0" w:color="D9D9D9"/>
+              <w:right w:val="single" w:sz="4" w:space="0" w:color="D9D9D9"/>
+            </w:tcBorders>
           </w:tcPr>
           <w:p>
+            <w:pPr>
+              <w:jc w:val="center"/>
+            </w:pPr>
             <w:r>
               <w:rPr>
                 <w:rFonts w:ascii="Segoe UI" w:hAnsi="Segoe UI"/>
+                <w:color w:val="333333"/>
                 <w:sz w:val="18"/>
               </w:rPr>
               <w:t>Vegan</w:t>
@@ -905,13 +1511,23 @@
         </w:tc>
         <w:tc>
           <w:tcPr>
-            <w:tcW w:type="dxa" w:w="2436"/>
-            <w:shd w:val="clear" w:color="auto" w:fill="F2F6FC"/>
+            <w:tcW w:type="dxa" w:w="2160"/>
+            <w:shd w:val="clear" w:color="auto" w:fill="FFFFFF"/>
+            <w:tcBorders>
+              <w:top w:val="single" w:sz="4" w:space="0" w:color="D9D9D9"/>
+              <w:left w:val="single" w:sz="4" w:space="0" w:color="D9D9D9"/>
+              <w:bottom w:val="single" w:sz="4" w:space="0" w:color="D9D9D9"/>
+              <w:right w:val="single" w:sz="4" w:space="0" w:color="D9D9D9"/>
+            </w:tcBorders>
           </w:tcPr>
           <w:p>
+            <w:pPr>
+              <w:jc w:val="center"/>
+            </w:pPr>
             <w:r>
               <w:rPr>
                 <w:rFonts w:ascii="Segoe UI" w:hAnsi="Segoe UI"/>
+                <w:color w:val="333333"/>
                 <w:sz w:val="18"/>
               </w:rPr>
               <w:t>45</w:t>
@@ -920,13 +1536,23 @@
         </w:tc>
         <w:tc>
           <w:tcPr>
-            <w:tcW w:type="dxa" w:w="2436"/>
-            <w:shd w:val="clear" w:color="auto" w:fill="F2F6FC"/>
+            <w:tcW w:type="dxa" w:w="2160"/>
+            <w:shd w:val="clear" w:color="auto" w:fill="FFFFFF"/>
+            <w:tcBorders>
+              <w:top w:val="single" w:sz="4" w:space="0" w:color="D9D9D9"/>
+              <w:left w:val="single" w:sz="4" w:space="0" w:color="D9D9D9"/>
+              <w:bottom w:val="single" w:sz="4" w:space="0" w:color="D9D9D9"/>
+              <w:right w:val="single" w:sz="4" w:space="0" w:color="D9D9D9"/>
+            </w:tcBorders>
           </w:tcPr>
           <w:p>
+            <w:pPr>
+              <w:jc w:val="center"/>
+            </w:pPr>
             <w:r>
               <w:rPr>
                 <w:rFonts w:ascii="Segoe UI" w:hAnsi="Segoe UI"/>
+                <w:color w:val="333333"/>
                 <w:sz w:val="18"/>
               </w:rPr>
               <w:t>Simsimiya: Toasted sesame seeds bound with sugar syrup, glucose, lemon.</w:t>
@@ -937,13 +1563,24 @@
       <w:tr>
         <w:tc>
           <w:tcPr>
-            <w:tcW w:type="dxa" w:w="2436"/>
-            <w:shd w:val="clear" w:color="auto" w:fill="FFFFFF"/>
+            <w:tcW w:type="dxa" w:w="2160"/>
+            <w:shd w:val="clear" w:color="auto" w:fill="F2F6FC"/>
+            <w:tcBorders>
+              <w:top w:val="single" w:sz="4" w:space="0" w:color="D9D9D9"/>
+              <w:left w:val="single" w:sz="4" w:space="0" w:color="D9D9D9"/>
+              <w:bottom w:val="single" w:sz="4" w:space="0" w:color="D9D9D9"/>
+              <w:right w:val="single" w:sz="4" w:space="0" w:color="D9D9D9"/>
+            </w:tcBorders>
           </w:tcPr>
           <w:p>
+            <w:pPr>
+              <w:jc w:val="left"/>
+            </w:pPr>
             <w:r>
               <w:rPr>
                 <w:rFonts w:ascii="Segoe UI" w:hAnsi="Segoe UI"/>
+                <w:b/>
+                <w:color w:val="1F3864"/>
                 <w:sz w:val="18"/>
               </w:rPr>
               <w:t>Spinach Fatayer</w:t>
@@ -952,13 +1589,23 @@
         </w:tc>
         <w:tc>
           <w:tcPr>
-            <w:tcW w:type="dxa" w:w="2436"/>
-            <w:shd w:val="clear" w:color="auto" w:fill="FFFFFF"/>
+            <w:tcW w:type="dxa" w:w="2160"/>
+            <w:shd w:val="clear" w:color="auto" w:fill="F2F6FC"/>
+            <w:tcBorders>
+              <w:top w:val="single" w:sz="4" w:space="0" w:color="D9D9D9"/>
+              <w:left w:val="single" w:sz="4" w:space="0" w:color="D9D9D9"/>
+              <w:bottom w:val="single" w:sz="4" w:space="0" w:color="D9D9D9"/>
+              <w:right w:val="single" w:sz="4" w:space="0" w:color="D9D9D9"/>
+            </w:tcBorders>
           </w:tcPr>
           <w:p>
+            <w:pPr>
+              <w:jc w:val="center"/>
+            </w:pPr>
             <w:r>
               <w:rPr>
                 <w:rFonts w:ascii="Segoe UI" w:hAnsi="Segoe UI"/>
+                <w:color w:val="333333"/>
                 <w:sz w:val="18"/>
               </w:rPr>
               <w:t>Vegan</w:t>
@@ -967,13 +1614,23 @@
         </w:tc>
         <w:tc>
           <w:tcPr>
-            <w:tcW w:type="dxa" w:w="2436"/>
-            <w:shd w:val="clear" w:color="auto" w:fill="FFFFFF"/>
+            <w:tcW w:type="dxa" w:w="2160"/>
+            <w:shd w:val="clear" w:color="auto" w:fill="F2F6FC"/>
+            <w:tcBorders>
+              <w:top w:val="single" w:sz="4" w:space="0" w:color="D9D9D9"/>
+              <w:left w:val="single" w:sz="4" w:space="0" w:color="D9D9D9"/>
+              <w:bottom w:val="single" w:sz="4" w:space="0" w:color="D9D9D9"/>
+              <w:right w:val="single" w:sz="4" w:space="0" w:color="D9D9D9"/>
+            </w:tcBorders>
           </w:tcPr>
           <w:p>
+            <w:pPr>
+              <w:jc w:val="center"/>
+            </w:pPr>
             <w:r>
               <w:rPr>
                 <w:rFonts w:ascii="Segoe UI" w:hAnsi="Segoe UI"/>
+                <w:color w:val="333333"/>
                 <w:sz w:val="18"/>
               </w:rPr>
               <w:t>44</w:t>
@@ -982,13 +1639,23 @@
         </w:tc>
         <w:tc>
           <w:tcPr>
-            <w:tcW w:type="dxa" w:w="2436"/>
-            <w:shd w:val="clear" w:color="auto" w:fill="FFFFFF"/>
+            <w:tcW w:type="dxa" w:w="2160"/>
+            <w:shd w:val="clear" w:color="auto" w:fill="F2F6FC"/>
+            <w:tcBorders>
+              <w:top w:val="single" w:sz="4" w:space="0" w:color="D9D9D9"/>
+              <w:left w:val="single" w:sz="4" w:space="0" w:color="D9D9D9"/>
+              <w:bottom w:val="single" w:sz="4" w:space="0" w:color="D9D9D9"/>
+              <w:right w:val="single" w:sz="4" w:space="0" w:color="D9D9D9"/>
+            </w:tcBorders>
           </w:tcPr>
           <w:p>
+            <w:pPr>
+              <w:jc w:val="center"/>
+            </w:pPr>
             <w:r>
               <w:rPr>
                 <w:rFonts w:ascii="Segoe UI" w:hAnsi="Segoe UI"/>
+                <w:color w:val="333333"/>
                 <w:sz w:val="18"/>
               </w:rPr>
               <w:t>Levantine spinach pie: Spinach, onions, sumac, pine nuts in olive oil dough.</w:t>
@@ -999,13 +1666,24 @@
       <w:tr>
         <w:tc>
           <w:tcPr>
-            <w:tcW w:type="dxa" w:w="2436"/>
-            <w:shd w:val="clear" w:color="auto" w:fill="F2F6FC"/>
+            <w:tcW w:type="dxa" w:w="2160"/>
+            <w:shd w:val="clear" w:color="auto" w:fill="FFFFFF"/>
+            <w:tcBorders>
+              <w:top w:val="single" w:sz="4" w:space="0" w:color="D9D9D9"/>
+              <w:left w:val="single" w:sz="4" w:space="0" w:color="D9D9D9"/>
+              <w:bottom w:val="single" w:sz="4" w:space="0" w:color="D9D9D9"/>
+              <w:right w:val="single" w:sz="4" w:space="0" w:color="D9D9D9"/>
+            </w:tcBorders>
           </w:tcPr>
           <w:p>
+            <w:pPr>
+              <w:jc w:val="left"/>
+            </w:pPr>
             <w:r>
               <w:rPr>
                 <w:rFonts w:ascii="Segoe UI" w:hAnsi="Segoe UI"/>
+                <w:b/>
+                <w:color w:val="1F3864"/>
                 <w:sz w:val="18"/>
               </w:rPr>
               <w:t>Onion Soup</w:t>
@@ -1014,13 +1692,23 @@
         </w:tc>
         <w:tc>
           <w:tcPr>
-            <w:tcW w:type="dxa" w:w="2436"/>
-            <w:shd w:val="clear" w:color="auto" w:fill="F2F6FC"/>
+            <w:tcW w:type="dxa" w:w="2160"/>
+            <w:shd w:val="clear" w:color="auto" w:fill="FFFFFF"/>
+            <w:tcBorders>
+              <w:top w:val="single" w:sz="4" w:space="0" w:color="D9D9D9"/>
+              <w:left w:val="single" w:sz="4" w:space="0" w:color="D9D9D9"/>
+              <w:bottom w:val="single" w:sz="4" w:space="0" w:color="D9D9D9"/>
+              <w:right w:val="single" w:sz="4" w:space="0" w:color="D9D9D9"/>
+            </w:tcBorders>
           </w:tcPr>
           <w:p>
+            <w:pPr>
+              <w:jc w:val="center"/>
+            </w:pPr>
             <w:r>
               <w:rPr>
                 <w:rFonts w:ascii="Segoe UI" w:hAnsi="Segoe UI"/>
+                <w:color w:val="333333"/>
                 <w:sz w:val="18"/>
               </w:rPr>
               <w:t>Vegan</w:t>
@@ -1029,13 +1717,23 @@
         </w:tc>
         <w:tc>
           <w:tcPr>
-            <w:tcW w:type="dxa" w:w="2436"/>
-            <w:shd w:val="clear" w:color="auto" w:fill="F2F6FC"/>
+            <w:tcW w:type="dxa" w:w="2160"/>
+            <w:shd w:val="clear" w:color="auto" w:fill="FFFFFF"/>
+            <w:tcBorders>
+              <w:top w:val="single" w:sz="4" w:space="0" w:color="D9D9D9"/>
+              <w:left w:val="single" w:sz="4" w:space="0" w:color="D9D9D9"/>
+              <w:bottom w:val="single" w:sz="4" w:space="0" w:color="D9D9D9"/>
+              <w:right w:val="single" w:sz="4" w:space="0" w:color="D9D9D9"/>
+            </w:tcBorders>
           </w:tcPr>
           <w:p>
+            <w:pPr>
+              <w:jc w:val="center"/>
+            </w:pPr>
             <w:r>
               <w:rPr>
                 <w:rFonts w:ascii="Segoe UI" w:hAnsi="Segoe UI"/>
+                <w:color w:val="333333"/>
                 <w:sz w:val="18"/>
               </w:rPr>
               <w:t>42</w:t>
@@ -1044,13 +1742,23 @@
         </w:tc>
         <w:tc>
           <w:tcPr>
-            <w:tcW w:type="dxa" w:w="2436"/>
-            <w:shd w:val="clear" w:color="auto" w:fill="F2F6FC"/>
+            <w:tcW w:type="dxa" w:w="2160"/>
+            <w:shd w:val="clear" w:color="auto" w:fill="FFFFFF"/>
+            <w:tcBorders>
+              <w:top w:val="single" w:sz="4" w:space="0" w:color="D9D9D9"/>
+              <w:left w:val="single" w:sz="4" w:space="0" w:color="D9D9D9"/>
+              <w:bottom w:val="single" w:sz="4" w:space="0" w:color="D9D9D9"/>
+              <w:right w:val="single" w:sz="4" w:space="0" w:color="D9D9D9"/>
+            </w:tcBorders>
           </w:tcPr>
           <w:p>
+            <w:pPr>
+              <w:jc w:val="center"/>
+            </w:pPr>
             <w:r>
               <w:rPr>
                 <w:rFonts w:ascii="Segoe UI" w:hAnsi="Segoe UI"/>
+                <w:color w:val="333333"/>
                 <w:sz w:val="18"/>
               </w:rPr>
               <w:t>Shorbat Basal: Caramelized onions, olive oil, vegetable broth, cumin.</w:t>
@@ -1061,13 +1769,24 @@
       <w:tr>
         <w:tc>
           <w:tcPr>
-            <w:tcW w:type="dxa" w:w="2436"/>
-            <w:shd w:val="clear" w:color="auto" w:fill="FFFFFF"/>
+            <w:tcW w:type="dxa" w:w="2160"/>
+            <w:shd w:val="clear" w:color="auto" w:fill="F2F6FC"/>
+            <w:tcBorders>
+              <w:top w:val="single" w:sz="4" w:space="0" w:color="D9D9D9"/>
+              <w:left w:val="single" w:sz="4" w:space="0" w:color="D9D9D9"/>
+              <w:bottom w:val="single" w:sz="4" w:space="0" w:color="D9D9D9"/>
+              <w:right w:val="single" w:sz="4" w:space="0" w:color="D9D9D9"/>
+            </w:tcBorders>
           </w:tcPr>
           <w:p>
+            <w:pPr>
+              <w:jc w:val="left"/>
+            </w:pPr>
             <w:r>
               <w:rPr>
                 <w:rFonts w:ascii="Segoe UI" w:hAnsi="Segoe UI"/>
+                <w:b/>
+                <w:color w:val="1F3864"/>
                 <w:sz w:val="18"/>
               </w:rPr>
               <w:t>Pomegranate Fattoush</w:t>
@@ -1076,13 +1795,23 @@
         </w:tc>
         <w:tc>
           <w:tcPr>
-            <w:tcW w:type="dxa" w:w="2436"/>
-            <w:shd w:val="clear" w:color="auto" w:fill="FFFFFF"/>
+            <w:tcW w:type="dxa" w:w="2160"/>
+            <w:shd w:val="clear" w:color="auto" w:fill="F2F6FC"/>
+            <w:tcBorders>
+              <w:top w:val="single" w:sz="4" w:space="0" w:color="D9D9D9"/>
+              <w:left w:val="single" w:sz="4" w:space="0" w:color="D9D9D9"/>
+              <w:bottom w:val="single" w:sz="4" w:space="0" w:color="D9D9D9"/>
+              <w:right w:val="single" w:sz="4" w:space="0" w:color="D9D9D9"/>
+            </w:tcBorders>
           </w:tcPr>
           <w:p>
+            <w:pPr>
+              <w:jc w:val="center"/>
+            </w:pPr>
             <w:r>
               <w:rPr>
                 <w:rFonts w:ascii="Segoe UI" w:hAnsi="Segoe UI"/>
+                <w:color w:val="333333"/>
                 <w:sz w:val="18"/>
               </w:rPr>
               <w:t>Vegan</w:t>
@@ -1091,13 +1820,23 @@
         </w:tc>
         <w:tc>
           <w:tcPr>
-            <w:tcW w:type="dxa" w:w="2436"/>
-            <w:shd w:val="clear" w:color="auto" w:fill="FFFFFF"/>
+            <w:tcW w:type="dxa" w:w="2160"/>
+            <w:shd w:val="clear" w:color="auto" w:fill="F2F6FC"/>
+            <w:tcBorders>
+              <w:top w:val="single" w:sz="4" w:space="0" w:color="D9D9D9"/>
+              <w:left w:val="single" w:sz="4" w:space="0" w:color="D9D9D9"/>
+              <w:bottom w:val="single" w:sz="4" w:space="0" w:color="D9D9D9"/>
+              <w:right w:val="single" w:sz="4" w:space="0" w:color="D9D9D9"/>
+            </w:tcBorders>
           </w:tcPr>
           <w:p>
+            <w:pPr>
+              <w:jc w:val="center"/>
+            </w:pPr>
             <w:r>
               <w:rPr>
                 <w:rFonts w:ascii="Segoe UI" w:hAnsi="Segoe UI"/>
+                <w:color w:val="333333"/>
                 <w:sz w:val="18"/>
               </w:rPr>
               <w:t>37</w:t>
@@ -1106,13 +1845,23 @@
         </w:tc>
         <w:tc>
           <w:tcPr>
-            <w:tcW w:type="dxa" w:w="2436"/>
-            <w:shd w:val="clear" w:color="auto" w:fill="FFFFFF"/>
+            <w:tcW w:type="dxa" w:w="2160"/>
+            <w:shd w:val="clear" w:color="auto" w:fill="F2F6FC"/>
+            <w:tcBorders>
+              <w:top w:val="single" w:sz="4" w:space="0" w:color="D9D9D9"/>
+              <w:left w:val="single" w:sz="4" w:space="0" w:color="D9D9D9"/>
+              <w:bottom w:val="single" w:sz="4" w:space="0" w:color="D9D9D9"/>
+              <w:right w:val="single" w:sz="4" w:space="0" w:color="D9D9D9"/>
+            </w:tcBorders>
           </w:tcPr>
           <w:p>
+            <w:pPr>
+              <w:jc w:val="center"/>
+            </w:pPr>
             <w:r>
               <w:rPr>
                 <w:rFonts w:ascii="Segoe UI" w:hAnsi="Segoe UI"/>
+                <w:color w:val="333333"/>
                 <w:sz w:val="18"/>
               </w:rPr>
               <w:t>Romaine, tomatoes, cucumbers, toasted pita chips, sumac, pomegranate molasses.</w:t>
@@ -1123,13 +1872,24 @@
       <w:tr>
         <w:tc>
           <w:tcPr>
-            <w:tcW w:type="dxa" w:w="2436"/>
-            <w:shd w:val="clear" w:color="auto" w:fill="F2F6FC"/>
+            <w:tcW w:type="dxa" w:w="2160"/>
+            <w:shd w:val="clear" w:color="auto" w:fill="FFFFFF"/>
+            <w:tcBorders>
+              <w:top w:val="single" w:sz="4" w:space="0" w:color="D9D9D9"/>
+              <w:left w:val="single" w:sz="4" w:space="0" w:color="D9D9D9"/>
+              <w:bottom w:val="single" w:sz="4" w:space="0" w:color="D9D9D9"/>
+              <w:right w:val="single" w:sz="4" w:space="0" w:color="D9D9D9"/>
+            </w:tcBorders>
           </w:tcPr>
           <w:p>
+            <w:pPr>
+              <w:jc w:val="left"/>
+            </w:pPr>
             <w:r>
               <w:rPr>
                 <w:rFonts w:ascii="Segoe UI" w:hAnsi="Segoe UI"/>
+                <w:b/>
+                <w:color w:val="1F3864"/>
                 <w:sz w:val="18"/>
               </w:rPr>
               <w:t>Spinach Stew</w:t>
@@ -1138,13 +1898,23 @@
         </w:tc>
         <w:tc>
           <w:tcPr>
-            <w:tcW w:type="dxa" w:w="2436"/>
-            <w:shd w:val="clear" w:color="auto" w:fill="F2F6FC"/>
+            <w:tcW w:type="dxa" w:w="2160"/>
+            <w:shd w:val="clear" w:color="auto" w:fill="FFFFFF"/>
+            <w:tcBorders>
+              <w:top w:val="single" w:sz="4" w:space="0" w:color="D9D9D9"/>
+              <w:left w:val="single" w:sz="4" w:space="0" w:color="D9D9D9"/>
+              <w:bottom w:val="single" w:sz="4" w:space="0" w:color="D9D9D9"/>
+              <w:right w:val="single" w:sz="4" w:space="0" w:color="D9D9D9"/>
+            </w:tcBorders>
           </w:tcPr>
           <w:p>
+            <w:pPr>
+              <w:jc w:val="center"/>
+            </w:pPr>
             <w:r>
               <w:rPr>
                 <w:rFonts w:ascii="Segoe UI" w:hAnsi="Segoe UI"/>
+                <w:color w:val="333333"/>
                 <w:sz w:val="18"/>
               </w:rPr>
               <w:t>Vegan</w:t>
@@ -1153,13 +1923,23 @@
         </w:tc>
         <w:tc>
           <w:tcPr>
-            <w:tcW w:type="dxa" w:w="2436"/>
-            <w:shd w:val="clear" w:color="auto" w:fill="F2F6FC"/>
+            <w:tcW w:type="dxa" w:w="2160"/>
+            <w:shd w:val="clear" w:color="auto" w:fill="FFFFFF"/>
+            <w:tcBorders>
+              <w:top w:val="single" w:sz="4" w:space="0" w:color="D9D9D9"/>
+              <w:left w:val="single" w:sz="4" w:space="0" w:color="D9D9D9"/>
+              <w:bottom w:val="single" w:sz="4" w:space="0" w:color="D9D9D9"/>
+              <w:right w:val="single" w:sz="4" w:space="0" w:color="D9D9D9"/>
+            </w:tcBorders>
           </w:tcPr>
           <w:p>
+            <w:pPr>
+              <w:jc w:val="center"/>
+            </w:pPr>
             <w:r>
               <w:rPr>
                 <w:rFonts w:ascii="Segoe UI" w:hAnsi="Segoe UI"/>
+                <w:color w:val="333333"/>
                 <w:sz w:val="18"/>
               </w:rPr>
               <w:t>32</w:t>
@@ -1168,13 +1948,23 @@
         </w:tc>
         <w:tc>
           <w:tcPr>
-            <w:tcW w:type="dxa" w:w="2436"/>
-            <w:shd w:val="clear" w:color="auto" w:fill="F2F6FC"/>
+            <w:tcW w:type="dxa" w:w="2160"/>
+            <w:shd w:val="clear" w:color="auto" w:fill="FFFFFF"/>
+            <w:tcBorders>
+              <w:top w:val="single" w:sz="4" w:space="0" w:color="D9D9D9"/>
+              <w:left w:val="single" w:sz="4" w:space="0" w:color="D9D9D9"/>
+              <w:bottom w:val="single" w:sz="4" w:space="0" w:color="D9D9D9"/>
+              <w:right w:val="single" w:sz="4" w:space="0" w:color="D9D9D9"/>
+            </w:tcBorders>
           </w:tcPr>
           <w:p>
+            <w:pPr>
+              <w:jc w:val="center"/>
+            </w:pPr>
             <w:r>
               <w:rPr>
                 <w:rFonts w:ascii="Segoe UI" w:hAnsi="Segoe UI"/>
+                <w:color w:val="333333"/>
                 <w:sz w:val="18"/>
               </w:rPr>
               <w:t>Sabanegh bil-Zayt: Fresh spinach, chickpeas, garlic, coriander, olive oil.</w:t>
@@ -1185,13 +1975,24 @@
       <w:tr>
         <w:tc>
           <w:tcPr>
-            <w:tcW w:type="dxa" w:w="2436"/>
-            <w:shd w:val="clear" w:color="auto" w:fill="FFFFFF"/>
+            <w:tcW w:type="dxa" w:w="2160"/>
+            <w:shd w:val="clear" w:color="auto" w:fill="F2F6FC"/>
+            <w:tcBorders>
+              <w:top w:val="single" w:sz="4" w:space="0" w:color="D9D9D9"/>
+              <w:left w:val="single" w:sz="4" w:space="0" w:color="D9D9D9"/>
+              <w:bottom w:val="single" w:sz="4" w:space="0" w:color="D9D9D9"/>
+              <w:right w:val="single" w:sz="4" w:space="0" w:color="D9D9D9"/>
+            </w:tcBorders>
           </w:tcPr>
           <w:p>
+            <w:pPr>
+              <w:jc w:val="left"/>
+            </w:pPr>
             <w:r>
               <w:rPr>
                 <w:rFonts w:ascii="Segoe UI" w:hAnsi="Segoe UI"/>
+                <w:b/>
+                <w:color w:val="1F3864"/>
                 <w:sz w:val="18"/>
               </w:rPr>
               <w:t>Fatayer Cheese</w:t>
@@ -1200,13 +2001,23 @@
         </w:tc>
         <w:tc>
           <w:tcPr>
-            <w:tcW w:type="dxa" w:w="2436"/>
-            <w:shd w:val="clear" w:color="auto" w:fill="FFFFFF"/>
+            <w:tcW w:type="dxa" w:w="2160"/>
+            <w:shd w:val="clear" w:color="auto" w:fill="F2F6FC"/>
+            <w:tcBorders>
+              <w:top w:val="single" w:sz="4" w:space="0" w:color="D9D9D9"/>
+              <w:left w:val="single" w:sz="4" w:space="0" w:color="D9D9D9"/>
+              <w:bottom w:val="single" w:sz="4" w:space="0" w:color="D9D9D9"/>
+              <w:right w:val="single" w:sz="4" w:space="0" w:color="D9D9D9"/>
+            </w:tcBorders>
           </w:tcPr>
           <w:p>
+            <w:pPr>
+              <w:jc w:val="center"/>
+            </w:pPr>
             <w:r>
               <w:rPr>
                 <w:rFonts w:ascii="Segoe UI" w:hAnsi="Segoe UI"/>
+                <w:color w:val="333333"/>
                 <w:sz w:val="18"/>
               </w:rPr>
               <w:t>Vegetarian</w:t>
@@ -1215,13 +2026,23 @@
         </w:tc>
         <w:tc>
           <w:tcPr>
-            <w:tcW w:type="dxa" w:w="2436"/>
-            <w:shd w:val="clear" w:color="auto" w:fill="FFFFFF"/>
+            <w:tcW w:type="dxa" w:w="2160"/>
+            <w:shd w:val="clear" w:color="auto" w:fill="F2F6FC"/>
+            <w:tcBorders>
+              <w:top w:val="single" w:sz="4" w:space="0" w:color="D9D9D9"/>
+              <w:left w:val="single" w:sz="4" w:space="0" w:color="D9D9D9"/>
+              <w:bottom w:val="single" w:sz="4" w:space="0" w:color="D9D9D9"/>
+              <w:right w:val="single" w:sz="4" w:space="0" w:color="D9D9D9"/>
+            </w:tcBorders>
           </w:tcPr>
           <w:p>
+            <w:pPr>
+              <w:jc w:val="center"/>
+            </w:pPr>
             <w:r>
               <w:rPr>
                 <w:rFonts w:ascii="Segoe UI" w:hAnsi="Segoe UI"/>
+                <w:color w:val="333333"/>
                 <w:sz w:val="18"/>
               </w:rPr>
               <w:t>86</w:t>
@@ -1230,13 +2051,23 @@
         </w:tc>
         <w:tc>
           <w:tcPr>
-            <w:tcW w:type="dxa" w:w="2436"/>
-            <w:shd w:val="clear" w:color="auto" w:fill="FFFFFF"/>
+            <w:tcW w:type="dxa" w:w="2160"/>
+            <w:shd w:val="clear" w:color="auto" w:fill="F2F6FC"/>
+            <w:tcBorders>
+              <w:top w:val="single" w:sz="4" w:space="0" w:color="D9D9D9"/>
+              <w:left w:val="single" w:sz="4" w:space="0" w:color="D9D9D9"/>
+              <w:bottom w:val="single" w:sz="4" w:space="0" w:color="D9D9D9"/>
+              <w:right w:val="single" w:sz="4" w:space="0" w:color="D9D9D9"/>
+            </w:tcBorders>
           </w:tcPr>
           <w:p>
+            <w:pPr>
+              <w:jc w:val="center"/>
+            </w:pPr>
             <w:r>
               <w:rPr>
                 <w:rFonts w:ascii="Segoe UI" w:hAnsi="Segoe UI"/>
+                <w:color w:val="333333"/>
                 <w:sz w:val="18"/>
               </w:rPr>
               <w:t>Pastry filled with dairy cheese (Akkawi / Halloumi / Nabulsi) and butter.</w:t>
@@ -1247,13 +2078,24 @@
       <w:tr>
         <w:tc>
           <w:tcPr>
-            <w:tcW w:type="dxa" w:w="2436"/>
-            <w:shd w:val="clear" w:color="auto" w:fill="F2F6FC"/>
+            <w:tcW w:type="dxa" w:w="2160"/>
+            <w:shd w:val="clear" w:color="auto" w:fill="FFFFFF"/>
+            <w:tcBorders>
+              <w:top w:val="single" w:sz="4" w:space="0" w:color="D9D9D9"/>
+              <w:left w:val="single" w:sz="4" w:space="0" w:color="D9D9D9"/>
+              <w:bottom w:val="single" w:sz="4" w:space="0" w:color="D9D9D9"/>
+              <w:right w:val="single" w:sz="4" w:space="0" w:color="D9D9D9"/>
+            </w:tcBorders>
           </w:tcPr>
           <w:p>
+            <w:pPr>
+              <w:jc w:val="left"/>
+            </w:pPr>
             <w:r>
               <w:rPr>
                 <w:rFonts w:ascii="Segoe UI" w:hAnsi="Segoe UI"/>
+                <w:b/>
+                <w:color w:val="1F3864"/>
                 <w:sz w:val="18"/>
               </w:rPr>
               <w:t>Saffron Cake</w:t>
@@ -1262,13 +2104,23 @@
         </w:tc>
         <w:tc>
           <w:tcPr>
-            <w:tcW w:type="dxa" w:w="2436"/>
-            <w:shd w:val="clear" w:color="auto" w:fill="F2F6FC"/>
+            <w:tcW w:type="dxa" w:w="2160"/>
+            <w:shd w:val="clear" w:color="auto" w:fill="FFFFFF"/>
+            <w:tcBorders>
+              <w:top w:val="single" w:sz="4" w:space="0" w:color="D9D9D9"/>
+              <w:left w:val="single" w:sz="4" w:space="0" w:color="D9D9D9"/>
+              <w:bottom w:val="single" w:sz="4" w:space="0" w:color="D9D9D9"/>
+              <w:right w:val="single" w:sz="4" w:space="0" w:color="D9D9D9"/>
+            </w:tcBorders>
           </w:tcPr>
           <w:p>
+            <w:pPr>
+              <w:jc w:val="center"/>
+            </w:pPr>
             <w:r>
               <w:rPr>
                 <w:rFonts w:ascii="Segoe UI" w:hAnsi="Segoe UI"/>
+                <w:color w:val="333333"/>
                 <w:sz w:val="18"/>
               </w:rPr>
               <w:t>Vegetarian</w:t>
@@ -1277,13 +2129,23 @@
         </w:tc>
         <w:tc>
           <w:tcPr>
-            <w:tcW w:type="dxa" w:w="2436"/>
-            <w:shd w:val="clear" w:color="auto" w:fill="F2F6FC"/>
+            <w:tcW w:type="dxa" w:w="2160"/>
+            <w:shd w:val="clear" w:color="auto" w:fill="FFFFFF"/>
+            <w:tcBorders>
+              <w:top w:val="single" w:sz="4" w:space="0" w:color="D9D9D9"/>
+              <w:left w:val="single" w:sz="4" w:space="0" w:color="D9D9D9"/>
+              <w:bottom w:val="single" w:sz="4" w:space="0" w:color="D9D9D9"/>
+              <w:right w:val="single" w:sz="4" w:space="0" w:color="D9D9D9"/>
+            </w:tcBorders>
           </w:tcPr>
           <w:p>
+            <w:pPr>
+              <w:jc w:val="center"/>
+            </w:pPr>
             <w:r>
               <w:rPr>
                 <w:rFonts w:ascii="Segoe UI" w:hAnsi="Segoe UI"/>
+                <w:color w:val="333333"/>
                 <w:sz w:val="18"/>
               </w:rPr>
               <w:t>59</w:t>
@@ -1292,13 +2154,23 @@
         </w:tc>
         <w:tc>
           <w:tcPr>
-            <w:tcW w:type="dxa" w:w="2436"/>
-            <w:shd w:val="clear" w:color="auto" w:fill="F2F6FC"/>
+            <w:tcW w:type="dxa" w:w="2160"/>
+            <w:shd w:val="clear" w:color="auto" w:fill="FFFFFF"/>
+            <w:tcBorders>
+              <w:top w:val="single" w:sz="4" w:space="0" w:color="D9D9D9"/>
+              <w:left w:val="single" w:sz="4" w:space="0" w:color="D9D9D9"/>
+              <w:bottom w:val="single" w:sz="4" w:space="0" w:color="D9D9D9"/>
+              <w:right w:val="single" w:sz="4" w:space="0" w:color="D9D9D9"/>
+            </w:tcBorders>
           </w:tcPr>
           <w:p>
+            <w:pPr>
+              <w:jc w:val="center"/>
+            </w:pPr>
             <w:r>
               <w:rPr>
                 <w:rFonts w:ascii="Segoe UI" w:hAnsi="Segoe UI"/>
+                <w:color w:val="333333"/>
                 <w:sz w:val="18"/>
               </w:rPr>
               <w:t>Sponge cake made with eggs, soaked in saffron condensed milk &amp; heavy cream.</w:t>
@@ -1309,13 +2181,24 @@
       <w:tr>
         <w:tc>
           <w:tcPr>
-            <w:tcW w:type="dxa" w:w="2436"/>
-            <w:shd w:val="clear" w:color="auto" w:fill="FFFFFF"/>
+            <w:tcW w:type="dxa" w:w="2160"/>
+            <w:shd w:val="clear" w:color="auto" w:fill="F2F6FC"/>
+            <w:tcBorders>
+              <w:top w:val="single" w:sz="4" w:space="0" w:color="D9D9D9"/>
+              <w:left w:val="single" w:sz="4" w:space="0" w:color="D9D9D9"/>
+              <w:bottom w:val="single" w:sz="4" w:space="0" w:color="D9D9D9"/>
+              <w:right w:val="single" w:sz="4" w:space="0" w:color="D9D9D9"/>
+            </w:tcBorders>
           </w:tcPr>
           <w:p>
+            <w:pPr>
+              <w:jc w:val="left"/>
+            </w:pPr>
             <w:r>
               <w:rPr>
                 <w:rFonts w:ascii="Segoe UI" w:hAnsi="Segoe UI"/>
+                <w:b/>
+                <w:color w:val="1F3864"/>
                 <w:sz w:val="18"/>
               </w:rPr>
               <w:t>Rice Pudding</w:t>
@@ -1324,13 +2207,23 @@
         </w:tc>
         <w:tc>
           <w:tcPr>
-            <w:tcW w:type="dxa" w:w="2436"/>
-            <w:shd w:val="clear" w:color="auto" w:fill="FFFFFF"/>
+            <w:tcW w:type="dxa" w:w="2160"/>
+            <w:shd w:val="clear" w:color="auto" w:fill="F2F6FC"/>
+            <w:tcBorders>
+              <w:top w:val="single" w:sz="4" w:space="0" w:color="D9D9D9"/>
+              <w:left w:val="single" w:sz="4" w:space="0" w:color="D9D9D9"/>
+              <w:bottom w:val="single" w:sz="4" w:space="0" w:color="D9D9D9"/>
+              <w:right w:val="single" w:sz="4" w:space="0" w:color="D9D9D9"/>
+            </w:tcBorders>
           </w:tcPr>
           <w:p>
+            <w:pPr>
+              <w:jc w:val="center"/>
+            </w:pPr>
             <w:r>
               <w:rPr>
                 <w:rFonts w:ascii="Segoe UI" w:hAnsi="Segoe UI"/>
+                <w:color w:val="333333"/>
                 <w:sz w:val="18"/>
               </w:rPr>
               <w:t>Vegetarian</w:t>
@@ -1339,13 +2232,23 @@
         </w:tc>
         <w:tc>
           <w:tcPr>
-            <w:tcW w:type="dxa" w:w="2436"/>
-            <w:shd w:val="clear" w:color="auto" w:fill="FFFFFF"/>
+            <w:tcW w:type="dxa" w:w="2160"/>
+            <w:shd w:val="clear" w:color="auto" w:fill="F2F6FC"/>
+            <w:tcBorders>
+              <w:top w:val="single" w:sz="4" w:space="0" w:color="D9D9D9"/>
+              <w:left w:val="single" w:sz="4" w:space="0" w:color="D9D9D9"/>
+              <w:bottom w:val="single" w:sz="4" w:space="0" w:color="D9D9D9"/>
+              <w:right w:val="single" w:sz="4" w:space="0" w:color="D9D9D9"/>
+            </w:tcBorders>
           </w:tcPr>
           <w:p>
+            <w:pPr>
+              <w:jc w:val="center"/>
+            </w:pPr>
             <w:r>
               <w:rPr>
                 <w:rFonts w:ascii="Segoe UI" w:hAnsi="Segoe UI"/>
+                <w:color w:val="333333"/>
                 <w:sz w:val="18"/>
               </w:rPr>
               <w:t>57</w:t>
@@ -1354,13 +2257,23 @@
         </w:tc>
         <w:tc>
           <w:tcPr>
-            <w:tcW w:type="dxa" w:w="2436"/>
-            <w:shd w:val="clear" w:color="auto" w:fill="FFFFFF"/>
+            <w:tcW w:type="dxa" w:w="2160"/>
+            <w:shd w:val="clear" w:color="auto" w:fill="F2F6FC"/>
+            <w:tcBorders>
+              <w:top w:val="single" w:sz="4" w:space="0" w:color="D9D9D9"/>
+              <w:left w:val="single" w:sz="4" w:space="0" w:color="D9D9D9"/>
+              <w:bottom w:val="single" w:sz="4" w:space="0" w:color="D9D9D9"/>
+              <w:right w:val="single" w:sz="4" w:space="0" w:color="D9D9D9"/>
+            </w:tcBorders>
           </w:tcPr>
           <w:p>
+            <w:pPr>
+              <w:jc w:val="center"/>
+            </w:pPr>
             <w:r>
               <w:rPr>
                 <w:rFonts w:ascii="Segoe UI" w:hAnsi="Segoe UI"/>
+                <w:color w:val="333333"/>
                 <w:sz w:val="18"/>
               </w:rPr>
               <w:t>Roz Bel Laban: Short-grain rice cooked in whole cow's milk and ashta cream.</w:t>
@@ -1371,13 +2284,24 @@
       <w:tr>
         <w:tc>
           <w:tcPr>
-            <w:tcW w:type="dxa" w:w="2436"/>
-            <w:shd w:val="clear" w:color="auto" w:fill="F2F6FC"/>
+            <w:tcW w:type="dxa" w:w="2160"/>
+            <w:shd w:val="clear" w:color="auto" w:fill="FFFFFF"/>
+            <w:tcBorders>
+              <w:top w:val="single" w:sz="4" w:space="0" w:color="D9D9D9"/>
+              <w:left w:val="single" w:sz="4" w:space="0" w:color="D9D9D9"/>
+              <w:bottom w:val="single" w:sz="4" w:space="0" w:color="D9D9D9"/>
+              <w:right w:val="single" w:sz="4" w:space="0" w:color="D9D9D9"/>
+            </w:tcBorders>
           </w:tcPr>
           <w:p>
+            <w:pPr>
+              <w:jc w:val="left"/>
+            </w:pPr>
             <w:r>
               <w:rPr>
                 <w:rFonts w:ascii="Segoe UI" w:hAnsi="Segoe UI"/>
+                <w:b/>
+                <w:color w:val="1F3864"/>
                 <w:sz w:val="18"/>
               </w:rPr>
               <w:t>Pistachio Sweet</w:t>
@@ -1386,13 +2310,23 @@
         </w:tc>
         <w:tc>
           <w:tcPr>
-            <w:tcW w:type="dxa" w:w="2436"/>
-            <w:shd w:val="clear" w:color="auto" w:fill="F2F6FC"/>
+            <w:tcW w:type="dxa" w:w="2160"/>
+            <w:shd w:val="clear" w:color="auto" w:fill="FFFFFF"/>
+            <w:tcBorders>
+              <w:top w:val="single" w:sz="4" w:space="0" w:color="D9D9D9"/>
+              <w:left w:val="single" w:sz="4" w:space="0" w:color="D9D9D9"/>
+              <w:bottom w:val="single" w:sz="4" w:space="0" w:color="D9D9D9"/>
+              <w:right w:val="single" w:sz="4" w:space="0" w:color="D9D9D9"/>
+            </w:tcBorders>
           </w:tcPr>
           <w:p>
+            <w:pPr>
+              <w:jc w:val="center"/>
+            </w:pPr>
             <w:r>
               <w:rPr>
                 <w:rFonts w:ascii="Segoe UI" w:hAnsi="Segoe UI"/>
+                <w:color w:val="333333"/>
                 <w:sz w:val="18"/>
               </w:rPr>
               <w:t>Vegetarian</w:t>
@@ -1401,13 +2335,23 @@
         </w:tc>
         <w:tc>
           <w:tcPr>
-            <w:tcW w:type="dxa" w:w="2436"/>
-            <w:shd w:val="clear" w:color="auto" w:fill="F2F6FC"/>
+            <w:tcW w:type="dxa" w:w="2160"/>
+            <w:shd w:val="clear" w:color="auto" w:fill="FFFFFF"/>
+            <w:tcBorders>
+              <w:top w:val="single" w:sz="4" w:space="0" w:color="D9D9D9"/>
+              <w:left w:val="single" w:sz="4" w:space="0" w:color="D9D9D9"/>
+              <w:bottom w:val="single" w:sz="4" w:space="0" w:color="D9D9D9"/>
+              <w:right w:val="single" w:sz="4" w:space="0" w:color="D9D9D9"/>
+            </w:tcBorders>
           </w:tcPr>
           <w:p>
+            <w:pPr>
+              <w:jc w:val="center"/>
+            </w:pPr>
             <w:r>
               <w:rPr>
                 <w:rFonts w:ascii="Segoe UI" w:hAnsi="Segoe UI"/>
+                <w:color w:val="333333"/>
                 <w:sz w:val="18"/>
               </w:rPr>
               <w:t>57</w:t>
@@ -1416,13 +2360,23 @@
         </w:tc>
         <w:tc>
           <w:tcPr>
-            <w:tcW w:type="dxa" w:w="2436"/>
-            <w:shd w:val="clear" w:color="auto" w:fill="F2F6FC"/>
+            <w:tcW w:type="dxa" w:w="2160"/>
+            <w:shd w:val="clear" w:color="auto" w:fill="FFFFFF"/>
+            <w:tcBorders>
+              <w:top w:val="single" w:sz="4" w:space="0" w:color="D9D9D9"/>
+              <w:left w:val="single" w:sz="4" w:space="0" w:color="D9D9D9"/>
+              <w:bottom w:val="single" w:sz="4" w:space="0" w:color="D9D9D9"/>
+              <w:right w:val="single" w:sz="4" w:space="0" w:color="D9D9D9"/>
+            </w:tcBorders>
           </w:tcPr>
           <w:p>
+            <w:pPr>
+              <w:jc w:val="center"/>
+            </w:pPr>
             <w:r>
               <w:rPr>
                 <w:rFonts w:ascii="Segoe UI" w:hAnsi="Segoe UI"/>
+                <w:color w:val="333333"/>
                 <w:sz w:val="18"/>
               </w:rPr>
               <w:t>Halawet el-Jibn / Mafroukeh: Contains sweet cheese, ashta, and clarified butter.</w:t>
@@ -1433,13 +2387,24 @@
       <w:tr>
         <w:tc>
           <w:tcPr>
-            <w:tcW w:type="dxa" w:w="2436"/>
-            <w:shd w:val="clear" w:color="auto" w:fill="FFFFFF"/>
+            <w:tcW w:type="dxa" w:w="2160"/>
+            <w:shd w:val="clear" w:color="auto" w:fill="F2F6FC"/>
+            <w:tcBorders>
+              <w:top w:val="single" w:sz="4" w:space="0" w:color="D9D9D9"/>
+              <w:left w:val="single" w:sz="4" w:space="0" w:color="D9D9D9"/>
+              <w:bottom w:val="single" w:sz="4" w:space="0" w:color="D9D9D9"/>
+              <w:right w:val="single" w:sz="4" w:space="0" w:color="D9D9D9"/>
+            </w:tcBorders>
           </w:tcPr>
           <w:p>
+            <w:pPr>
+              <w:jc w:val="left"/>
+            </w:pPr>
             <w:r>
               <w:rPr>
                 <w:rFonts w:ascii="Segoe UI" w:hAnsi="Segoe UI"/>
+                <w:b/>
+                <w:color w:val="1F3864"/>
                 <w:sz w:val="18"/>
               </w:rPr>
               <w:t>Pistachio Tamriya</w:t>
@@ -1448,13 +2413,23 @@
         </w:tc>
         <w:tc>
           <w:tcPr>
-            <w:tcW w:type="dxa" w:w="2436"/>
-            <w:shd w:val="clear" w:color="auto" w:fill="FFFFFF"/>
+            <w:tcW w:type="dxa" w:w="2160"/>
+            <w:shd w:val="clear" w:color="auto" w:fill="F2F6FC"/>
+            <w:tcBorders>
+              <w:top w:val="single" w:sz="4" w:space="0" w:color="D9D9D9"/>
+              <w:left w:val="single" w:sz="4" w:space="0" w:color="D9D9D9"/>
+              <w:bottom w:val="single" w:sz="4" w:space="0" w:color="D9D9D9"/>
+              <w:right w:val="single" w:sz="4" w:space="0" w:color="D9D9D9"/>
+            </w:tcBorders>
           </w:tcPr>
           <w:p>
+            <w:pPr>
+              <w:jc w:val="center"/>
+            </w:pPr>
             <w:r>
               <w:rPr>
                 <w:rFonts w:ascii="Segoe UI" w:hAnsi="Segoe UI"/>
+                <w:color w:val="333333"/>
                 <w:sz w:val="18"/>
               </w:rPr>
               <w:t>Vegetarian</w:t>
@@ -1463,13 +2438,23 @@
         </w:tc>
         <w:tc>
           <w:tcPr>
-            <w:tcW w:type="dxa" w:w="2436"/>
-            <w:shd w:val="clear" w:color="auto" w:fill="FFFFFF"/>
+            <w:tcW w:type="dxa" w:w="2160"/>
+            <w:shd w:val="clear" w:color="auto" w:fill="F2F6FC"/>
+            <w:tcBorders>
+              <w:top w:val="single" w:sz="4" w:space="0" w:color="D9D9D9"/>
+              <w:left w:val="single" w:sz="4" w:space="0" w:color="D9D9D9"/>
+              <w:bottom w:val="single" w:sz="4" w:space="0" w:color="D9D9D9"/>
+              <w:right w:val="single" w:sz="4" w:space="0" w:color="D9D9D9"/>
+            </w:tcBorders>
           </w:tcPr>
           <w:p>
+            <w:pPr>
+              <w:jc w:val="center"/>
+            </w:pPr>
             <w:r>
               <w:rPr>
                 <w:rFonts w:ascii="Segoe UI" w:hAnsi="Segoe UI"/>
+                <w:color w:val="333333"/>
                 <w:sz w:val="18"/>
               </w:rPr>
               <w:t>21</w:t>
@@ -1478,13 +2463,23 @@
         </w:tc>
         <w:tc>
           <w:tcPr>
-            <w:tcW w:type="dxa" w:w="2436"/>
-            <w:shd w:val="clear" w:color="auto" w:fill="FFFFFF"/>
+            <w:tcW w:type="dxa" w:w="2160"/>
+            <w:shd w:val="clear" w:color="auto" w:fill="F2F6FC"/>
+            <w:tcBorders>
+              <w:top w:val="single" w:sz="4" w:space="0" w:color="D9D9D9"/>
+              <w:left w:val="single" w:sz="4" w:space="0" w:color="D9D9D9"/>
+              <w:bottom w:val="single" w:sz="4" w:space="0" w:color="D9D9D9"/>
+              <w:right w:val="single" w:sz="4" w:space="0" w:color="D9D9D9"/>
+            </w:tcBorders>
           </w:tcPr>
           <w:p>
+            <w:pPr>
+              <w:jc w:val="center"/>
+            </w:pPr>
             <w:r>
               <w:rPr>
                 <w:rFonts w:ascii="Segoe UI" w:hAnsi="Segoe UI"/>
+                <w:color w:val="333333"/>
                 <w:sz w:val="18"/>
               </w:rPr>
               <w:t>Date confection pan-roasted in clarified butter (samneh / ghee).</w:t>
@@ -1495,13 +2490,24 @@
       <w:tr>
         <w:tc>
           <w:tcPr>
-            <w:tcW w:type="dxa" w:w="2436"/>
-            <w:shd w:val="clear" w:color="auto" w:fill="F2F6FC"/>
+            <w:tcW w:type="dxa" w:w="2160"/>
+            <w:shd w:val="clear" w:color="auto" w:fill="FFFFFF"/>
+            <w:tcBorders>
+              <w:top w:val="single" w:sz="4" w:space="0" w:color="D9D9D9"/>
+              <w:left w:val="single" w:sz="4" w:space="0" w:color="D9D9D9"/>
+              <w:bottom w:val="single" w:sz="4" w:space="0" w:color="D9D9D9"/>
+              <w:right w:val="single" w:sz="4" w:space="0" w:color="D9D9D9"/>
+            </w:tcBorders>
           </w:tcPr>
           <w:p>
+            <w:pPr>
+              <w:jc w:val="left"/>
+            </w:pPr>
             <w:r>
               <w:rPr>
                 <w:rFonts w:ascii="Segoe UI" w:hAnsi="Segoe UI"/>
+                <w:b/>
+                <w:color w:val="1F3864"/>
                 <w:sz w:val="18"/>
               </w:rPr>
               <w:t>Tamriya</w:t>
@@ -1510,13 +2516,23 @@
         </w:tc>
         <w:tc>
           <w:tcPr>
-            <w:tcW w:type="dxa" w:w="2436"/>
-            <w:shd w:val="clear" w:color="auto" w:fill="F2F6FC"/>
+            <w:tcW w:type="dxa" w:w="2160"/>
+            <w:shd w:val="clear" w:color="auto" w:fill="FFFFFF"/>
+            <w:tcBorders>
+              <w:top w:val="single" w:sz="4" w:space="0" w:color="D9D9D9"/>
+              <w:left w:val="single" w:sz="4" w:space="0" w:color="D9D9D9"/>
+              <w:bottom w:val="single" w:sz="4" w:space="0" w:color="D9D9D9"/>
+              <w:right w:val="single" w:sz="4" w:space="0" w:color="D9D9D9"/>
+            </w:tcBorders>
           </w:tcPr>
           <w:p>
+            <w:pPr>
+              <w:jc w:val="center"/>
+            </w:pPr>
             <w:r>
               <w:rPr>
                 <w:rFonts w:ascii="Segoe UI" w:hAnsi="Segoe UI"/>
+                <w:color w:val="333333"/>
                 <w:sz w:val="18"/>
               </w:rPr>
               <w:t>Vegetarian</w:t>
@@ -1525,13 +2541,23 @@
         </w:tc>
         <w:tc>
           <w:tcPr>
-            <w:tcW w:type="dxa" w:w="2436"/>
-            <w:shd w:val="clear" w:color="auto" w:fill="F2F6FC"/>
+            <w:tcW w:type="dxa" w:w="2160"/>
+            <w:shd w:val="clear" w:color="auto" w:fill="FFFFFF"/>
+            <w:tcBorders>
+              <w:top w:val="single" w:sz="4" w:space="0" w:color="D9D9D9"/>
+              <w:left w:val="single" w:sz="4" w:space="0" w:color="D9D9D9"/>
+              <w:bottom w:val="single" w:sz="4" w:space="0" w:color="D9D9D9"/>
+              <w:right w:val="single" w:sz="4" w:space="0" w:color="D9D9D9"/>
+            </w:tcBorders>
           </w:tcPr>
           <w:p>
+            <w:pPr>
+              <w:jc w:val="center"/>
+            </w:pPr>
             <w:r>
               <w:rPr>
                 <w:rFonts w:ascii="Segoe UI" w:hAnsi="Segoe UI"/>
+                <w:color w:val="333333"/>
                 <w:sz w:val="18"/>
               </w:rPr>
               <w:t>13</w:t>
@@ -1540,13 +2566,23 @@
         </w:tc>
         <w:tc>
           <w:tcPr>
-            <w:tcW w:type="dxa" w:w="2436"/>
-            <w:shd w:val="clear" w:color="auto" w:fill="F2F6FC"/>
+            <w:tcW w:type="dxa" w:w="2160"/>
+            <w:shd w:val="clear" w:color="auto" w:fill="FFFFFF"/>
+            <w:tcBorders>
+              <w:top w:val="single" w:sz="4" w:space="0" w:color="D9D9D9"/>
+              <w:left w:val="single" w:sz="4" w:space="0" w:color="D9D9D9"/>
+              <w:bottom w:val="single" w:sz="4" w:space="0" w:color="D9D9D9"/>
+              <w:right w:val="single" w:sz="4" w:space="0" w:color="D9D9D9"/>
+            </w:tcBorders>
           </w:tcPr>
           <w:p>
+            <w:pPr>
+              <w:jc w:val="center"/>
+            </w:pPr>
             <w:r>
               <w:rPr>
                 <w:rFonts w:ascii="Segoe UI" w:hAnsi="Segoe UI"/>
+                <w:color w:val="333333"/>
                 <w:sz w:val="18"/>
               </w:rPr>
               <w:t>Authentic Saudi date confection pan-roasted in samneh (animal butterfat).</w:t>
@@ -1566,14 +2602,19 @@
           <w:rFonts w:ascii="Segoe UI" w:hAnsi="Segoe UI"/>
           <w:color w:val="1F3864"/>
         </w:rPr>
-        <w:t>3. Benchmark Visualizations &amp; Confusion Matrices</w:t>
+        <w:t>3. Benchmark Visualizations &amp; Comparative Performance</w:t>
       </w:r>
+    </w:p>
+    <w:p>
+      <w:pPr>
+        <w:jc w:val="center"/>
+      </w:pPr>
     </w:p>
     <w:p>
       <w:r>
         <w:drawing>
           <wp:inline xmlns:a="http://schemas.openxmlformats.org/drawingml/2006/main" xmlns:pic="http://schemas.openxmlformats.org/drawingml/2006/picture">
-            <wp:extent cx="5669280" cy="2475277"/>
+            <wp:extent cx="5669280" cy="2639596"/>
             <wp:docPr id="1" name="Picture 1"/>
             <wp:cNvGraphicFramePr>
               <a:graphicFrameLocks noChangeAspect="1"/>
@@ -1582,7 +2623,7 @@
               <a:graphicData uri="http://schemas.openxmlformats.org/drawingml/2006/picture">
                 <pic:pic>
                   <pic:nvPicPr>
-                    <pic:cNvPr id="0" name="vegan_veg_confusion_matrix.png"/>
+                    <pic:cNvPr id="0" name="vegan_veg_restaurant_accuracy.png"/>
                     <pic:cNvPicPr/>
                   </pic:nvPicPr>
                   <pic:blipFill>
@@ -1594,7 +2635,7 @@
                   <pic:spPr>
                     <a:xfrm>
                       <a:off x="0" y="0"/>
-                      <a:ext cx="5669280" cy="2475277"/>
+                      <a:ext cx="5669280" cy="2639596"/>
                     </a:xfrm>
                     <a:prstGeom prst="rect"/>
                   </pic:spPr>
@@ -1615,15 +2656,20 @@
           <w:color w:val="595959"/>
           <w:sz w:val="18"/>
         </w:rPr>
-        <w:t>Figure 1 — MobileNetV3-Large Validation and Test Split Confusion Matrices</w:t>
+        <w:t>Figure 1 — Real-World Arabic Restaurant Test: Uncropped Baseline vs. YOLOv8-Seg Cropping (+12.50% Jump)</w:t>
       </w:r>
     </w:p>
     <w:p/>
     <w:p>
+      <w:pPr>
+        <w:jc w:val="center"/>
+      </w:pPr>
+    </w:p>
+    <w:p>
       <w:r>
         <w:drawing>
           <wp:inline xmlns:a="http://schemas.openxmlformats.org/drawingml/2006/main" xmlns:pic="http://schemas.openxmlformats.org/drawingml/2006/picture">
-            <wp:extent cx="5486400" cy="2701636"/>
+            <wp:extent cx="5669280" cy="2883358"/>
             <wp:docPr id="2" name="Picture 2"/>
             <wp:cNvGraphicFramePr>
               <a:graphicFrameLocks noChangeAspect="1"/>
@@ -1632,7 +2678,7 @@
               <a:graphicData uri="http://schemas.openxmlformats.org/drawingml/2006/picture">
                 <pic:pic>
                   <pic:nvPicPr>
-                    <pic:cNvPr id="0" name="vegan_veg_restaurant_accuracy.png"/>
+                    <pic:cNvPr id="0" name="vegan_veg_confusion_matrix.png"/>
                     <pic:cNvPicPr/>
                   </pic:nvPicPr>
                   <pic:blipFill>
@@ -1644,7 +2690,7 @@
                   <pic:spPr>
                     <a:xfrm>
                       <a:off x="0" y="0"/>
-                      <a:ext cx="5486400" cy="2701636"/>
+                      <a:ext cx="5669280" cy="2883358"/>
                     </a:xfrm>
                     <a:prstGeom prst="rect"/>
                   </pic:spPr>
@@ -1665,10 +2711,15 @@
           <w:color w:val="595959"/>
           <w:sz w:val="18"/>
         </w:rPr>
-        <w:t>Figure 2 — Real-World Arabic Restaurant Test: Per-Dish Accuracy Breakdown</w:t>
+        <w:t>Figure 2 — Held-Out Test Confusion Matrices: Baseline vs. YOLOv8-Seg Cropped</w:t>
       </w:r>
     </w:p>
     <w:p/>
+    <w:p>
+      <w:pPr>
+        <w:jc w:val="center"/>
+      </w:pPr>
+    </w:p>
     <w:p>
       <w:r>
         <w:drawing>
@@ -1715,7 +2766,7 @@
           <w:color w:val="595959"/>
           <w:sz w:val="18"/>
         </w:rPr>
-        <w:t>Figure 3 — Two-Stage Transfer Learning Convergence Curves (AdamW + Cosine Annealing)</w:t>
+        <w:t>Figure 3 — Two-Stage Transfer Learning Convergence Curves (AdamW + Cosine Annealing on Segmented Crops)</w:t>
       </w:r>
     </w:p>
     <w:p/>
@@ -1729,42 +2780,52 @@
           <w:rFonts w:ascii="Segoe UI" w:hAnsi="Segoe UI"/>
           <w:color w:val="1F3864"/>
         </w:rPr>
-        <w:t>4. Real-World Restaurant Test Results (24 Images)</w:t>
+        <w:t>4. Real-World Restaurant Test Breakdown (24 Unseen Photos)</w:t>
       </w:r>
     </w:p>
     <w:p>
+      <w:pPr>
+        <w:spacing w:line="276" w:lineRule="auto" w:after="120"/>
+      </w:pPr>
       <w:r>
         <w:rPr>
           <w:rFonts w:ascii="Segoe UI" w:hAnsi="Segoe UI"/>
-          <w:b w:val="0"/>
-          <w:i w:val="0"/>
-          <w:color w:val="262626"/>
+          <w:color w:val="333333"/>
           <w:sz w:val="20"/>
         </w:rPr>
-        <w:t>The model was tested against unseen, real-world Arabic restaurant photos from the Restaurant testing data set:</w:t>
+        <w:t>The model was benchmarked against the external Arabic restaurant test set. Below is the per-dish accuracy before and after YOLOv8-Seg polygon cropping:</w:t>
       </w:r>
     </w:p>
     <w:tbl>
       <w:tblPr>
-        <w:tblStyle w:val="TableGrid"/>
         <w:tblW w:type="auto" w:w="0"/>
         <w:jc w:val="center"/>
+        <w:tblLayout w:type="fixed"/>
         <w:tblLook w:firstColumn="1" w:firstRow="1" w:lastColumn="0" w:lastRow="0" w:noHBand="0" w:noVBand="1" w:val="04A0"/>
       </w:tblPr>
       <w:tblGrid>
-        <w:gridCol w:w="1949"/>
-        <w:gridCol w:w="1949"/>
-        <w:gridCol w:w="1949"/>
-        <w:gridCol w:w="1949"/>
-        <w:gridCol w:w="1949"/>
+        <w:gridCol w:w="1728"/>
+        <w:gridCol w:w="1728"/>
+        <w:gridCol w:w="1728"/>
+        <w:gridCol w:w="1728"/>
+        <w:gridCol w:w="1728"/>
       </w:tblGrid>
       <w:tr>
         <w:tc>
           <w:tcPr>
-            <w:tcW w:type="dxa" w:w="1949"/>
+            <w:tcW w:type="dxa" w:w="1728"/>
             <w:shd w:val="clear" w:color="auto" w:fill="1F3864"/>
+            <w:tcBorders>
+              <w:top w:val="single" w:sz="4" w:space="0" w:color="D9D9D9"/>
+              <w:left w:val="single" w:sz="4" w:space="0" w:color="D9D9D9"/>
+              <w:bottom w:val="single" w:sz="4" w:space="0" w:color="D9D9D9"/>
+              <w:right w:val="single" w:sz="4" w:space="0" w:color="D9D9D9"/>
+            </w:tcBorders>
           </w:tcPr>
           <w:p>
+            <w:pPr>
+              <w:jc w:val="center"/>
+            </w:pPr>
             <w:r>
               <w:rPr>
                 <w:rFonts w:ascii="Segoe UI" w:hAnsi="Segoe UI"/>
@@ -1778,10 +2839,19 @@
         </w:tc>
         <w:tc>
           <w:tcPr>
-            <w:tcW w:type="dxa" w:w="1949"/>
+            <w:tcW w:type="dxa" w:w="1728"/>
             <w:shd w:val="clear" w:color="auto" w:fill="1F3864"/>
+            <w:tcBorders>
+              <w:top w:val="single" w:sz="4" w:space="0" w:color="D9D9D9"/>
+              <w:left w:val="single" w:sz="4" w:space="0" w:color="D9D9D9"/>
+              <w:bottom w:val="single" w:sz="4" w:space="0" w:color="D9D9D9"/>
+              <w:right w:val="single" w:sz="4" w:space="0" w:color="D9D9D9"/>
+            </w:tcBorders>
           </w:tcPr>
           <w:p>
+            <w:pPr>
+              <w:jc w:val="center"/>
+            </w:pPr>
             <w:r>
               <w:rPr>
                 <w:rFonts w:ascii="Segoe UI" w:hAnsi="Segoe UI"/>
@@ -1795,10 +2865,19 @@
         </w:tc>
         <w:tc>
           <w:tcPr>
-            <w:tcW w:type="dxa" w:w="1949"/>
+            <w:tcW w:type="dxa" w:w="1728"/>
             <w:shd w:val="clear" w:color="auto" w:fill="1F3864"/>
+            <w:tcBorders>
+              <w:top w:val="single" w:sz="4" w:space="0" w:color="D9D9D9"/>
+              <w:left w:val="single" w:sz="4" w:space="0" w:color="D9D9D9"/>
+              <w:bottom w:val="single" w:sz="4" w:space="0" w:color="D9D9D9"/>
+              <w:right w:val="single" w:sz="4" w:space="0" w:color="D9D9D9"/>
+            </w:tcBorders>
           </w:tcPr>
           <w:p>
+            <w:pPr>
+              <w:jc w:val="center"/>
+            </w:pPr>
             <w:r>
               <w:rPr>
                 <w:rFonts w:ascii="Segoe UI" w:hAnsi="Segoe UI"/>
@@ -1806,16 +2885,25 @@
                 <w:color w:val="FFFFFF"/>
                 <w:sz w:val="19"/>
               </w:rPr>
-              <w:t>Correct / Total</w:t>
+              <w:t>Baseline Acc.</w:t>
             </w:r>
           </w:p>
         </w:tc>
         <w:tc>
           <w:tcPr>
-            <w:tcW w:type="dxa" w:w="1949"/>
+            <w:tcW w:type="dxa" w:w="1728"/>
             <w:shd w:val="clear" w:color="auto" w:fill="1F3864"/>
+            <w:tcBorders>
+              <w:top w:val="single" w:sz="4" w:space="0" w:color="D9D9D9"/>
+              <w:left w:val="single" w:sz="4" w:space="0" w:color="D9D9D9"/>
+              <w:bottom w:val="single" w:sz="4" w:space="0" w:color="D9D9D9"/>
+              <w:right w:val="single" w:sz="4" w:space="0" w:color="D9D9D9"/>
+            </w:tcBorders>
           </w:tcPr>
           <w:p>
+            <w:pPr>
+              <w:jc w:val="center"/>
+            </w:pPr>
             <w:r>
               <w:rPr>
                 <w:rFonts w:ascii="Segoe UI" w:hAnsi="Segoe UI"/>
@@ -1823,16 +2911,25 @@
                 <w:color w:val="FFFFFF"/>
                 <w:sz w:val="19"/>
               </w:rPr>
-              <w:t>Accuracy</w:t>
+              <w:t>YOLOv8-Seg Acc.</w:t>
             </w:r>
           </w:p>
         </w:tc>
         <w:tc>
           <w:tcPr>
-            <w:tcW w:type="dxa" w:w="1949"/>
+            <w:tcW w:type="dxa" w:w="1728"/>
             <w:shd w:val="clear" w:color="auto" w:fill="1F3864"/>
+            <w:tcBorders>
+              <w:top w:val="single" w:sz="4" w:space="0" w:color="D9D9D9"/>
+              <w:left w:val="single" w:sz="4" w:space="0" w:color="D9D9D9"/>
+              <w:bottom w:val="single" w:sz="4" w:space="0" w:color="D9D9D9"/>
+              <w:right w:val="single" w:sz="4" w:space="0" w:color="D9D9D9"/>
+            </w:tcBorders>
           </w:tcPr>
           <w:p>
+            <w:pPr>
+              <w:jc w:val="center"/>
+            </w:pPr>
             <w:r>
               <w:rPr>
                 <w:rFonts w:ascii="Segoe UI" w:hAnsi="Segoe UI"/>
@@ -1840,7 +2937,7 @@
                 <w:color w:val="FFFFFF"/>
                 <w:sz w:val="19"/>
               </w:rPr>
-              <w:t>Culinary Analysis</w:t>
+              <w:t>Culinary Analysis &amp; Error Recovery</w:t>
             </w:r>
           </w:p>
         </w:tc>
@@ -1848,13 +2945,24 @@
       <w:tr>
         <w:tc>
           <w:tcPr>
-            <w:tcW w:type="dxa" w:w="1949"/>
-            <w:shd w:val="clear" w:color="auto" w:fill="F2F6FC"/>
+            <w:tcW w:type="dxa" w:w="1728"/>
+            <w:shd w:val="clear" w:color="auto" w:fill="FFFFFF"/>
+            <w:tcBorders>
+              <w:top w:val="single" w:sz="4" w:space="0" w:color="D9D9D9"/>
+              <w:left w:val="single" w:sz="4" w:space="0" w:color="D9D9D9"/>
+              <w:bottom w:val="single" w:sz="4" w:space="0" w:color="D9D9D9"/>
+              <w:right w:val="single" w:sz="4" w:space="0" w:color="D9D9D9"/>
+            </w:tcBorders>
           </w:tcPr>
           <w:p>
+            <w:pPr>
+              <w:jc w:val="left"/>
+            </w:pPr>
             <w:r>
               <w:rPr>
                 <w:rFonts w:ascii="Segoe UI" w:hAnsi="Segoe UI"/>
+                <w:b/>
+                <w:color w:val="1F3864"/>
                 <w:sz w:val="18"/>
               </w:rPr>
               <w:t>Hummus</w:t>
@@ -1863,13 +2971,23 @@
         </w:tc>
         <w:tc>
           <w:tcPr>
-            <w:tcW w:type="dxa" w:w="1949"/>
-            <w:shd w:val="clear" w:color="auto" w:fill="F2F6FC"/>
+            <w:tcW w:type="dxa" w:w="1728"/>
+            <w:shd w:val="clear" w:color="auto" w:fill="FFFFFF"/>
+            <w:tcBorders>
+              <w:top w:val="single" w:sz="4" w:space="0" w:color="D9D9D9"/>
+              <w:left w:val="single" w:sz="4" w:space="0" w:color="D9D9D9"/>
+              <w:bottom w:val="single" w:sz="4" w:space="0" w:color="D9D9D9"/>
+              <w:right w:val="single" w:sz="4" w:space="0" w:color="D9D9D9"/>
+            </w:tcBorders>
           </w:tcPr>
           <w:p>
+            <w:pPr>
+              <w:jc w:val="center"/>
+            </w:pPr>
             <w:r>
               <w:rPr>
                 <w:rFonts w:ascii="Segoe UI" w:hAnsi="Segoe UI"/>
+                <w:color w:val="333333"/>
                 <w:sz w:val="18"/>
               </w:rPr>
               <w:t>Vegan</w:t>
@@ -1878,46 +2996,76 @@
         </w:tc>
         <w:tc>
           <w:tcPr>
-            <w:tcW w:type="dxa" w:w="1949"/>
-            <w:shd w:val="clear" w:color="auto" w:fill="F2F6FC"/>
+            <w:tcW w:type="dxa" w:w="1728"/>
+            <w:shd w:val="clear" w:color="auto" w:fill="FFFFFF"/>
+            <w:tcBorders>
+              <w:top w:val="single" w:sz="4" w:space="0" w:color="D9D9D9"/>
+              <w:left w:val="single" w:sz="4" w:space="0" w:color="D9D9D9"/>
+              <w:bottom w:val="single" w:sz="4" w:space="0" w:color="D9D9D9"/>
+              <w:right w:val="single" w:sz="4" w:space="0" w:color="D9D9D9"/>
+            </w:tcBorders>
           </w:tcPr>
           <w:p>
+            <w:pPr>
+              <w:jc w:val="center"/>
+            </w:pPr>
             <w:r>
               <w:rPr>
                 <w:rFonts w:ascii="Segoe UI" w:hAnsi="Segoe UI"/>
+                <w:color w:val="333333"/>
                 <w:sz w:val="18"/>
               </w:rPr>
-              <w:t>5 / 5</w:t>
+              <w:t>5 / 5 (100%)</w:t>
             </w:r>
           </w:p>
         </w:tc>
         <w:tc>
           <w:tcPr>
-            <w:tcW w:type="dxa" w:w="1949"/>
-            <w:shd w:val="clear" w:color="auto" w:fill="F2F6FC"/>
+            <w:tcW w:type="dxa" w:w="1728"/>
+            <w:shd w:val="clear" w:color="auto" w:fill="FFFFFF"/>
+            <w:tcBorders>
+              <w:top w:val="single" w:sz="4" w:space="0" w:color="D9D9D9"/>
+              <w:left w:val="single" w:sz="4" w:space="0" w:color="D9D9D9"/>
+              <w:bottom w:val="single" w:sz="4" w:space="0" w:color="D9D9D9"/>
+              <w:right w:val="single" w:sz="4" w:space="0" w:color="D9D9D9"/>
+            </w:tcBorders>
           </w:tcPr>
           <w:p>
+            <w:pPr>
+              <w:jc w:val="center"/>
+            </w:pPr>
             <w:r>
               <w:rPr>
                 <w:rFonts w:ascii="Segoe UI" w:hAnsi="Segoe UI"/>
+                <w:color w:val="333333"/>
                 <w:sz w:val="18"/>
               </w:rPr>
-              <w:t>100.0%</w:t>
+              <w:t>5 / 5 (100%)</w:t>
             </w:r>
           </w:p>
         </w:tc>
         <w:tc>
           <w:tcPr>
-            <w:tcW w:type="dxa" w:w="1949"/>
-            <w:shd w:val="clear" w:color="auto" w:fill="F2F6FC"/>
+            <w:tcW w:type="dxa" w:w="1728"/>
+            <w:shd w:val="clear" w:color="auto" w:fill="FFFFFF"/>
+            <w:tcBorders>
+              <w:top w:val="single" w:sz="4" w:space="0" w:color="D9D9D9"/>
+              <w:left w:val="single" w:sz="4" w:space="0" w:color="D9D9D9"/>
+              <w:bottom w:val="single" w:sz="4" w:space="0" w:color="D9D9D9"/>
+              <w:right w:val="single" w:sz="4" w:space="0" w:color="D9D9D9"/>
+            </w:tcBorders>
           </w:tcPr>
           <w:p>
+            <w:pPr>
+              <w:jc w:val="left"/>
+            </w:pPr>
             <w:r>
               <w:rPr>
                 <w:rFonts w:ascii="Segoe UI" w:hAnsi="Segoe UI"/>
+                <w:color w:val="333333"/>
                 <w:sz w:val="18"/>
               </w:rPr>
-              <w:t>Perfect plant-based legume dip recognition.</w:t>
+              <w:t>Perfect plant-based legume dip recognition in both modes.</w:t>
             </w:r>
           </w:p>
         </w:tc>
@@ -1925,13 +3073,24 @@
       <w:tr>
         <w:tc>
           <w:tcPr>
-            <w:tcW w:type="dxa" w:w="1949"/>
-            <w:shd w:val="clear" w:color="auto" w:fill="FFFFFF"/>
+            <w:tcW w:type="dxa" w:w="1728"/>
+            <w:shd w:val="clear" w:color="auto" w:fill="F2F6FC"/>
+            <w:tcBorders>
+              <w:top w:val="single" w:sz="4" w:space="0" w:color="D9D9D9"/>
+              <w:left w:val="single" w:sz="4" w:space="0" w:color="D9D9D9"/>
+              <w:bottom w:val="single" w:sz="4" w:space="0" w:color="D9D9D9"/>
+              <w:right w:val="single" w:sz="4" w:space="0" w:color="D9D9D9"/>
+            </w:tcBorders>
           </w:tcPr>
           <w:p>
+            <w:pPr>
+              <w:jc w:val="left"/>
+            </w:pPr>
             <w:r>
               <w:rPr>
                 <w:rFonts w:ascii="Segoe UI" w:hAnsi="Segoe UI"/>
+                <w:b/>
+                <w:color w:val="1F3864"/>
                 <w:sz w:val="18"/>
               </w:rPr>
               <w:t>Okra Tagine</w:t>
@@ -1940,13 +3099,23 @@
         </w:tc>
         <w:tc>
           <w:tcPr>
-            <w:tcW w:type="dxa" w:w="1949"/>
-            <w:shd w:val="clear" w:color="auto" w:fill="FFFFFF"/>
+            <w:tcW w:type="dxa" w:w="1728"/>
+            <w:shd w:val="clear" w:color="auto" w:fill="F2F6FC"/>
+            <w:tcBorders>
+              <w:top w:val="single" w:sz="4" w:space="0" w:color="D9D9D9"/>
+              <w:left w:val="single" w:sz="4" w:space="0" w:color="D9D9D9"/>
+              <w:bottom w:val="single" w:sz="4" w:space="0" w:color="D9D9D9"/>
+              <w:right w:val="single" w:sz="4" w:space="0" w:color="D9D9D9"/>
+            </w:tcBorders>
           </w:tcPr>
           <w:p>
+            <w:pPr>
+              <w:jc w:val="center"/>
+            </w:pPr>
             <w:r>
               <w:rPr>
                 <w:rFonts w:ascii="Segoe UI" w:hAnsi="Segoe UI"/>
+                <w:color w:val="333333"/>
                 <w:sz w:val="18"/>
               </w:rPr>
               <w:t>Vegan</w:t>
@@ -1955,46 +3124,76 @@
         </w:tc>
         <w:tc>
           <w:tcPr>
-            <w:tcW w:type="dxa" w:w="1949"/>
-            <w:shd w:val="clear" w:color="auto" w:fill="FFFFFF"/>
+            <w:tcW w:type="dxa" w:w="1728"/>
+            <w:shd w:val="clear" w:color="auto" w:fill="F2F6FC"/>
+            <w:tcBorders>
+              <w:top w:val="single" w:sz="4" w:space="0" w:color="D9D9D9"/>
+              <w:left w:val="single" w:sz="4" w:space="0" w:color="D9D9D9"/>
+              <w:bottom w:val="single" w:sz="4" w:space="0" w:color="D9D9D9"/>
+              <w:right w:val="single" w:sz="4" w:space="0" w:color="D9D9D9"/>
+            </w:tcBorders>
           </w:tcPr>
           <w:p>
+            <w:pPr>
+              <w:jc w:val="center"/>
+            </w:pPr>
             <w:r>
               <w:rPr>
                 <w:rFonts w:ascii="Segoe UI" w:hAnsi="Segoe UI"/>
+                <w:color w:val="333333"/>
                 <w:sz w:val="18"/>
               </w:rPr>
-              <w:t>4 / 4</w:t>
+              <w:t>4 / 4 (100%)</w:t>
             </w:r>
           </w:p>
         </w:tc>
         <w:tc>
           <w:tcPr>
-            <w:tcW w:type="dxa" w:w="1949"/>
-            <w:shd w:val="clear" w:color="auto" w:fill="FFFFFF"/>
+            <w:tcW w:type="dxa" w:w="1728"/>
+            <w:shd w:val="clear" w:color="auto" w:fill="F2F6FC"/>
+            <w:tcBorders>
+              <w:top w:val="single" w:sz="4" w:space="0" w:color="D9D9D9"/>
+              <w:left w:val="single" w:sz="4" w:space="0" w:color="D9D9D9"/>
+              <w:bottom w:val="single" w:sz="4" w:space="0" w:color="D9D9D9"/>
+              <w:right w:val="single" w:sz="4" w:space="0" w:color="D9D9D9"/>
+            </w:tcBorders>
           </w:tcPr>
           <w:p>
+            <w:pPr>
+              <w:jc w:val="center"/>
+            </w:pPr>
             <w:r>
               <w:rPr>
                 <w:rFonts w:ascii="Segoe UI" w:hAnsi="Segoe UI"/>
+                <w:color w:val="333333"/>
                 <w:sz w:val="18"/>
               </w:rPr>
-              <w:t>100.0%</w:t>
+              <w:t>4 / 4 (100%)</w:t>
             </w:r>
           </w:p>
         </w:tc>
         <w:tc>
           <w:tcPr>
-            <w:tcW w:type="dxa" w:w="1949"/>
-            <w:shd w:val="clear" w:color="auto" w:fill="FFFFFF"/>
+            <w:tcW w:type="dxa" w:w="1728"/>
+            <w:shd w:val="clear" w:color="auto" w:fill="F2F6FC"/>
+            <w:tcBorders>
+              <w:top w:val="single" w:sz="4" w:space="0" w:color="D9D9D9"/>
+              <w:left w:val="single" w:sz="4" w:space="0" w:color="D9D9D9"/>
+              <w:bottom w:val="single" w:sz="4" w:space="0" w:color="D9D9D9"/>
+              <w:right w:val="single" w:sz="4" w:space="0" w:color="D9D9D9"/>
+            </w:tcBorders>
           </w:tcPr>
           <w:p>
+            <w:pPr>
+              <w:jc w:val="left"/>
+            </w:pPr>
             <w:r>
               <w:rPr>
                 <w:rFonts w:ascii="Segoe UI" w:hAnsi="Segoe UI"/>
+                <w:color w:val="333333"/>
                 <w:sz w:val="18"/>
               </w:rPr>
-              <w:t>Correctly identified as olive-oil vegetable stew.</w:t>
+              <w:t>Accurately recognizes olive-oil vegetable stew across all lighting.</w:t>
             </w:r>
           </w:p>
         </w:tc>
@@ -2002,13 +3201,24 @@
       <w:tr>
         <w:tc>
           <w:tcPr>
-            <w:tcW w:type="dxa" w:w="1949"/>
-            <w:shd w:val="clear" w:color="auto" w:fill="F2F6FC"/>
+            <w:tcW w:type="dxa" w:w="1728"/>
+            <w:shd w:val="clear" w:color="auto" w:fill="FFFFFF"/>
+            <w:tcBorders>
+              <w:top w:val="single" w:sz="4" w:space="0" w:color="D9D9D9"/>
+              <w:left w:val="single" w:sz="4" w:space="0" w:color="D9D9D9"/>
+              <w:bottom w:val="single" w:sz="4" w:space="0" w:color="D9D9D9"/>
+              <w:right w:val="single" w:sz="4" w:space="0" w:color="D9D9D9"/>
+            </w:tcBorders>
           </w:tcPr>
           <w:p>
+            <w:pPr>
+              <w:jc w:val="left"/>
+            </w:pPr>
             <w:r>
               <w:rPr>
                 <w:rFonts w:ascii="Segoe UI" w:hAnsi="Segoe UI"/>
+                <w:b/>
+                <w:color w:val="1F3864"/>
                 <w:sz w:val="18"/>
               </w:rPr>
               <w:t>Tamees Bread</w:t>
@@ -2017,13 +3227,23 @@
         </w:tc>
         <w:tc>
           <w:tcPr>
-            <w:tcW w:type="dxa" w:w="1949"/>
-            <w:shd w:val="clear" w:color="auto" w:fill="F2F6FC"/>
+            <w:tcW w:type="dxa" w:w="1728"/>
+            <w:shd w:val="clear" w:color="auto" w:fill="FFFFFF"/>
+            <w:tcBorders>
+              <w:top w:val="single" w:sz="4" w:space="0" w:color="D9D9D9"/>
+              <w:left w:val="single" w:sz="4" w:space="0" w:color="D9D9D9"/>
+              <w:bottom w:val="single" w:sz="4" w:space="0" w:color="D9D9D9"/>
+              <w:right w:val="single" w:sz="4" w:space="0" w:color="D9D9D9"/>
+            </w:tcBorders>
           </w:tcPr>
           <w:p>
+            <w:pPr>
+              <w:jc w:val="center"/>
+            </w:pPr>
             <w:r>
               <w:rPr>
                 <w:rFonts w:ascii="Segoe UI" w:hAnsi="Segoe UI"/>
+                <w:color w:val="333333"/>
                 <w:sz w:val="18"/>
               </w:rPr>
               <w:t>Vegan</w:t>
@@ -2032,46 +3252,76 @@
         </w:tc>
         <w:tc>
           <w:tcPr>
-            <w:tcW w:type="dxa" w:w="1949"/>
-            <w:shd w:val="clear" w:color="auto" w:fill="F2F6FC"/>
+            <w:tcW w:type="dxa" w:w="1728"/>
+            <w:shd w:val="clear" w:color="auto" w:fill="FFFFFF"/>
+            <w:tcBorders>
+              <w:top w:val="single" w:sz="4" w:space="0" w:color="D9D9D9"/>
+              <w:left w:val="single" w:sz="4" w:space="0" w:color="D9D9D9"/>
+              <w:bottom w:val="single" w:sz="4" w:space="0" w:color="D9D9D9"/>
+              <w:right w:val="single" w:sz="4" w:space="0" w:color="D9D9D9"/>
+            </w:tcBorders>
           </w:tcPr>
           <w:p>
+            <w:pPr>
+              <w:jc w:val="center"/>
+            </w:pPr>
             <w:r>
               <w:rPr>
                 <w:rFonts w:ascii="Segoe UI" w:hAnsi="Segoe UI"/>
+                <w:color w:val="333333"/>
                 <w:sz w:val="18"/>
               </w:rPr>
-              <w:t>5 / 5</w:t>
+              <w:t>5 / 5 (100%)</w:t>
             </w:r>
           </w:p>
         </w:tc>
         <w:tc>
           <w:tcPr>
-            <w:tcW w:type="dxa" w:w="1949"/>
-            <w:shd w:val="clear" w:color="auto" w:fill="F2F6FC"/>
+            <w:tcW w:type="dxa" w:w="1728"/>
+            <w:shd w:val="clear" w:color="auto" w:fill="FFFFFF"/>
+            <w:tcBorders>
+              <w:top w:val="single" w:sz="4" w:space="0" w:color="D9D9D9"/>
+              <w:left w:val="single" w:sz="4" w:space="0" w:color="D9D9D9"/>
+              <w:bottom w:val="single" w:sz="4" w:space="0" w:color="D9D9D9"/>
+              <w:right w:val="single" w:sz="4" w:space="0" w:color="D9D9D9"/>
+            </w:tcBorders>
           </w:tcPr>
           <w:p>
+            <w:pPr>
+              <w:jc w:val="center"/>
+            </w:pPr>
             <w:r>
               <w:rPr>
                 <w:rFonts w:ascii="Segoe UI" w:hAnsi="Segoe UI"/>
+                <w:color w:val="333333"/>
                 <w:sz w:val="18"/>
               </w:rPr>
-              <w:t>100.0%</w:t>
+              <w:t>5 / 5 (100%)</w:t>
             </w:r>
           </w:p>
         </w:tc>
         <w:tc>
           <w:tcPr>
-            <w:tcW w:type="dxa" w:w="1949"/>
-            <w:shd w:val="clear" w:color="auto" w:fill="F2F6FC"/>
+            <w:tcW w:type="dxa" w:w="1728"/>
+            <w:shd w:val="clear" w:color="auto" w:fill="FFFFFF"/>
+            <w:tcBorders>
+              <w:top w:val="single" w:sz="4" w:space="0" w:color="D9D9D9"/>
+              <w:left w:val="single" w:sz="4" w:space="0" w:color="D9D9D9"/>
+              <w:bottom w:val="single" w:sz="4" w:space="0" w:color="D9D9D9"/>
+              <w:right w:val="single" w:sz="4" w:space="0" w:color="D9D9D9"/>
+            </w:tcBorders>
           </w:tcPr>
           <w:p>
+            <w:pPr>
+              <w:jc w:val="left"/>
+            </w:pPr>
             <w:r>
               <w:rPr>
                 <w:rFonts w:ascii="Segoe UI" w:hAnsi="Segoe UI"/>
+                <w:color w:val="333333"/>
                 <w:sz w:val="18"/>
               </w:rPr>
-              <w:t>Perfect recognition of tandoor plain flatbread.</w:t>
+              <w:t>Perfect recognition of Saudi tandoor flatbread without dairy.</w:t>
             </w:r>
           </w:p>
         </w:tc>
@@ -2079,13 +3329,24 @@
       <w:tr>
         <w:tc>
           <w:tcPr>
-            <w:tcW w:type="dxa" w:w="1949"/>
-            <w:shd w:val="clear" w:color="auto" w:fill="FFFFFF"/>
+            <w:tcW w:type="dxa" w:w="1728"/>
+            <w:shd w:val="clear" w:color="auto" w:fill="F2F6FC"/>
+            <w:tcBorders>
+              <w:top w:val="single" w:sz="4" w:space="0" w:color="D9D9D9"/>
+              <w:left w:val="single" w:sz="4" w:space="0" w:color="D9D9D9"/>
+              <w:bottom w:val="single" w:sz="4" w:space="0" w:color="D9D9D9"/>
+              <w:right w:val="single" w:sz="4" w:space="0" w:color="D9D9D9"/>
+            </w:tcBorders>
           </w:tcPr>
           <w:p>
+            <w:pPr>
+              <w:jc w:val="left"/>
+            </w:pPr>
             <w:r>
               <w:rPr>
                 <w:rFonts w:ascii="Segoe UI" w:hAnsi="Segoe UI"/>
+                <w:b/>
+                <w:color w:val="1F3864"/>
                 <w:sz w:val="18"/>
               </w:rPr>
               <w:t>Cheese Fatayer</w:t>
@@ -2094,13 +3355,23 @@
         </w:tc>
         <w:tc>
           <w:tcPr>
-            <w:tcW w:type="dxa" w:w="1949"/>
-            <w:shd w:val="clear" w:color="auto" w:fill="FFFFFF"/>
+            <w:tcW w:type="dxa" w:w="1728"/>
+            <w:shd w:val="clear" w:color="auto" w:fill="F2F6FC"/>
+            <w:tcBorders>
+              <w:top w:val="single" w:sz="4" w:space="0" w:color="D9D9D9"/>
+              <w:left w:val="single" w:sz="4" w:space="0" w:color="D9D9D9"/>
+              <w:bottom w:val="single" w:sz="4" w:space="0" w:color="D9D9D9"/>
+              <w:right w:val="single" w:sz="4" w:space="0" w:color="D9D9D9"/>
+            </w:tcBorders>
           </w:tcPr>
           <w:p>
+            <w:pPr>
+              <w:jc w:val="center"/>
+            </w:pPr>
             <w:r>
               <w:rPr>
                 <w:rFonts w:ascii="Segoe UI" w:hAnsi="Segoe UI"/>
+                <w:color w:val="333333"/>
                 <w:sz w:val="18"/>
               </w:rPr>
               <w:t>Vegetarian</w:t>
@@ -2109,46 +3380,76 @@
         </w:tc>
         <w:tc>
           <w:tcPr>
-            <w:tcW w:type="dxa" w:w="1949"/>
-            <w:shd w:val="clear" w:color="auto" w:fill="FFFFFF"/>
+            <w:tcW w:type="dxa" w:w="1728"/>
+            <w:shd w:val="clear" w:color="auto" w:fill="F2F6FC"/>
+            <w:tcBorders>
+              <w:top w:val="single" w:sz="4" w:space="0" w:color="D9D9D9"/>
+              <w:left w:val="single" w:sz="4" w:space="0" w:color="D9D9D9"/>
+              <w:bottom w:val="single" w:sz="4" w:space="0" w:color="D9D9D9"/>
+              <w:right w:val="single" w:sz="4" w:space="0" w:color="D9D9D9"/>
+            </w:tcBorders>
           </w:tcPr>
           <w:p>
+            <w:pPr>
+              <w:jc w:val="center"/>
+            </w:pPr>
             <w:r>
               <w:rPr>
                 <w:rFonts w:ascii="Segoe UI" w:hAnsi="Segoe UI"/>
+                <w:color w:val="333333"/>
                 <w:sz w:val="18"/>
               </w:rPr>
-              <w:t>4 / 5</w:t>
+              <w:t>4 / 5 (80%)</w:t>
             </w:r>
           </w:p>
         </w:tc>
         <w:tc>
           <w:tcPr>
-            <w:tcW w:type="dxa" w:w="1949"/>
-            <w:shd w:val="clear" w:color="auto" w:fill="FFFFFF"/>
+            <w:tcW w:type="dxa" w:w="1728"/>
+            <w:shd w:val="clear" w:color="auto" w:fill="F2F6FC"/>
+            <w:tcBorders>
+              <w:top w:val="single" w:sz="4" w:space="0" w:color="D9D9D9"/>
+              <w:left w:val="single" w:sz="4" w:space="0" w:color="D9D9D9"/>
+              <w:bottom w:val="single" w:sz="4" w:space="0" w:color="D9D9D9"/>
+              <w:right w:val="single" w:sz="4" w:space="0" w:color="D9D9D9"/>
+            </w:tcBorders>
           </w:tcPr>
           <w:p>
+            <w:pPr>
+              <w:jc w:val="center"/>
+            </w:pPr>
             <w:r>
               <w:rPr>
                 <w:rFonts w:ascii="Segoe UI" w:hAnsi="Segoe UI"/>
+                <w:color w:val="333333"/>
                 <w:sz w:val="18"/>
               </w:rPr>
-              <w:t>80.0%</w:t>
+              <w:t>4 / 5 (80%)</w:t>
             </w:r>
           </w:p>
         </w:tc>
         <w:tc>
           <w:tcPr>
-            <w:tcW w:type="dxa" w:w="1949"/>
-            <w:shd w:val="clear" w:color="auto" w:fill="FFFFFF"/>
+            <w:tcW w:type="dxa" w:w="1728"/>
+            <w:shd w:val="clear" w:color="auto" w:fill="F2F6FC"/>
+            <w:tcBorders>
+              <w:top w:val="single" w:sz="4" w:space="0" w:color="D9D9D9"/>
+              <w:left w:val="single" w:sz="4" w:space="0" w:color="D9D9D9"/>
+              <w:bottom w:val="single" w:sz="4" w:space="0" w:color="D9D9D9"/>
+              <w:right w:val="single" w:sz="4" w:space="0" w:color="D9D9D9"/>
+            </w:tcBorders>
           </w:tcPr>
           <w:p>
+            <w:pPr>
+              <w:jc w:val="left"/>
+            </w:pPr>
             <w:r>
               <w:rPr>
                 <w:rFonts w:ascii="Segoe UI" w:hAnsi="Segoe UI"/>
+                <w:color w:val="333333"/>
                 <w:sz w:val="18"/>
               </w:rPr>
-              <w:t>Successfully detects dairy cheese filling; recovered from previous veg failure.</w:t>
+              <w:t>Detects dairy cheese stuffing; 1 pastry misclassified as vegan.</w:t>
             </w:r>
           </w:p>
         </w:tc>
@@ -2156,28 +3457,49 @@
       <w:tr>
         <w:tc>
           <w:tcPr>
-            <w:tcW w:type="dxa" w:w="1949"/>
-            <w:shd w:val="clear" w:color="auto" w:fill="F2F6FC"/>
+            <w:tcW w:type="dxa" w:w="1728"/>
+            <w:shd w:val="clear" w:color="auto" w:fill="FFFFFF"/>
+            <w:tcBorders>
+              <w:top w:val="single" w:sz="4" w:space="0" w:color="D9D9D9"/>
+              <w:left w:val="single" w:sz="4" w:space="0" w:color="D9D9D9"/>
+              <w:bottom w:val="single" w:sz="4" w:space="0" w:color="D9D9D9"/>
+              <w:right w:val="single" w:sz="4" w:space="0" w:color="D9D9D9"/>
+            </w:tcBorders>
           </w:tcPr>
           <w:p>
+            <w:pPr>
+              <w:jc w:val="left"/>
+            </w:pPr>
             <w:r>
               <w:rPr>
                 <w:rFonts w:ascii="Segoe UI" w:hAnsi="Segoe UI"/>
+                <w:b/>
+                <w:color w:val="1F3864"/>
                 <w:sz w:val="18"/>
               </w:rPr>
-              <w:t>Za’atara Manaqish</w:t>
+              <w:t>Za’atar Manaqish</w:t>
             </w:r>
           </w:p>
         </w:tc>
         <w:tc>
           <w:tcPr>
-            <w:tcW w:type="dxa" w:w="1949"/>
-            <w:shd w:val="clear" w:color="auto" w:fill="F2F6FC"/>
+            <w:tcW w:type="dxa" w:w="1728"/>
+            <w:shd w:val="clear" w:color="auto" w:fill="FFFFFF"/>
+            <w:tcBorders>
+              <w:top w:val="single" w:sz="4" w:space="0" w:color="D9D9D9"/>
+              <w:left w:val="single" w:sz="4" w:space="0" w:color="D9D9D9"/>
+              <w:bottom w:val="single" w:sz="4" w:space="0" w:color="D9D9D9"/>
+              <w:right w:val="single" w:sz="4" w:space="0" w:color="D9D9D9"/>
+            </w:tcBorders>
           </w:tcPr>
           <w:p>
+            <w:pPr>
+              <w:jc w:val="center"/>
+            </w:pPr>
             <w:r>
               <w:rPr>
                 <w:rFonts w:ascii="Segoe UI" w:hAnsi="Segoe UI"/>
+                <w:color w:val="333333"/>
                 <w:sz w:val="18"/>
               </w:rPr>
               <w:t>Vegan</w:t>
@@ -2186,46 +3508,76 @@
         </w:tc>
         <w:tc>
           <w:tcPr>
-            <w:tcW w:type="dxa" w:w="1949"/>
-            <w:shd w:val="clear" w:color="auto" w:fill="F2F6FC"/>
+            <w:tcW w:type="dxa" w:w="1728"/>
+            <w:shd w:val="clear" w:color="auto" w:fill="FFFFFF"/>
+            <w:tcBorders>
+              <w:top w:val="single" w:sz="4" w:space="0" w:color="D9D9D9"/>
+              <w:left w:val="single" w:sz="4" w:space="0" w:color="D9D9D9"/>
+              <w:bottom w:val="single" w:sz="4" w:space="0" w:color="D9D9D9"/>
+              <w:right w:val="single" w:sz="4" w:space="0" w:color="D9D9D9"/>
+            </w:tcBorders>
           </w:tcPr>
           <w:p>
+            <w:pPr>
+              <w:jc w:val="center"/>
+            </w:pPr>
             <w:r>
               <w:rPr>
                 <w:rFonts w:ascii="Segoe UI" w:hAnsi="Segoe UI"/>
+                <w:color w:val="333333"/>
                 <w:sz w:val="18"/>
               </w:rPr>
-              <w:t>2 / 5</w:t>
+              <w:t>2 / 5 (40%)</w:t>
             </w:r>
           </w:p>
         </w:tc>
         <w:tc>
           <w:tcPr>
-            <w:tcW w:type="dxa" w:w="1949"/>
-            <w:shd w:val="clear" w:color="auto" w:fill="F2F6FC"/>
+            <w:tcW w:type="dxa" w:w="1728"/>
+            <w:shd w:val="clear" w:color="auto" w:fill="FFFFFF"/>
+            <w:tcBorders>
+              <w:top w:val="single" w:sz="4" w:space="0" w:color="D9D9D9"/>
+              <w:left w:val="single" w:sz="4" w:space="0" w:color="D9D9D9"/>
+              <w:bottom w:val="single" w:sz="4" w:space="0" w:color="D9D9D9"/>
+              <w:right w:val="single" w:sz="4" w:space="0" w:color="D9D9D9"/>
+            </w:tcBorders>
           </w:tcPr>
           <w:p>
+            <w:pPr>
+              <w:jc w:val="center"/>
+            </w:pPr>
             <w:r>
               <w:rPr>
                 <w:rFonts w:ascii="Segoe UI" w:hAnsi="Segoe UI"/>
+                <w:color w:val="333333"/>
                 <w:sz w:val="18"/>
               </w:rPr>
-              <w:t>40.0%</w:t>
+              <w:t>5 / 5 (100%)</w:t>
             </w:r>
           </w:p>
         </w:tc>
         <w:tc>
           <w:tcPr>
-            <w:tcW w:type="dxa" w:w="1949"/>
-            <w:shd w:val="clear" w:color="auto" w:fill="F2F6FC"/>
+            <w:tcW w:type="dxa" w:w="1728"/>
+            <w:shd w:val="clear" w:color="auto" w:fill="FFFFFF"/>
+            <w:tcBorders>
+              <w:top w:val="single" w:sz="4" w:space="0" w:color="D9D9D9"/>
+              <w:left w:val="single" w:sz="4" w:space="0" w:color="D9D9D9"/>
+              <w:bottom w:val="single" w:sz="4" w:space="0" w:color="D9D9D9"/>
+              <w:right w:val="single" w:sz="4" w:space="0" w:color="D9D9D9"/>
+            </w:tcBorders>
           </w:tcPr>
           <w:p>
+            <w:pPr>
+              <w:jc w:val="left"/>
+            </w:pPr>
             <w:r>
               <w:rPr>
                 <w:rFonts w:ascii="Segoe UI" w:hAnsi="Segoe UI"/>
+                <w:color w:val="333333"/>
                 <w:sz w:val="18"/>
               </w:rPr>
-              <w:t>Heavy olive oil sheen sometimes mimics melted cheese glaze.</w:t>
+              <w:t>+60% GAIN. Mask isolates dark thyme/oil layer, removing cheese false positive.</w:t>
             </w:r>
           </w:p>
         </w:tc>
@@ -2233,13 +3585,24 @@
       <w:tr>
         <w:tc>
           <w:tcPr>
-            <w:tcW w:type="dxa" w:w="1949"/>
-            <w:shd w:val="clear" w:color="auto" w:fill="FFFFFF"/>
+            <w:tcW w:type="dxa" w:w="1728"/>
+            <w:shd w:val="clear" w:color="auto" w:fill="F2F6FC"/>
+            <w:tcBorders>
+              <w:top w:val="single" w:sz="4" w:space="0" w:color="D9D9D9"/>
+              <w:left w:val="single" w:sz="4" w:space="0" w:color="D9D9D9"/>
+              <w:bottom w:val="single" w:sz="4" w:space="0" w:color="D9D9D9"/>
+              <w:right w:val="single" w:sz="4" w:space="0" w:color="D9D9D9"/>
+            </w:tcBorders>
           </w:tcPr>
           <w:p>
+            <w:pPr>
+              <w:jc w:val="left"/>
+            </w:pPr>
             <w:r>
               <w:rPr>
                 <w:rFonts w:ascii="Segoe UI" w:hAnsi="Segoe UI"/>
+                <w:b/>
+                <w:color w:val="1F3864"/>
                 <w:sz w:val="18"/>
               </w:rPr>
               <w:t>OVERALL</w:t>
@@ -2248,13 +3611,23 @@
         </w:tc>
         <w:tc>
           <w:tcPr>
-            <w:tcW w:type="dxa" w:w="1949"/>
-            <w:shd w:val="clear" w:color="auto" w:fill="FFFFFF"/>
+            <w:tcW w:type="dxa" w:w="1728"/>
+            <w:shd w:val="clear" w:color="auto" w:fill="F2F6FC"/>
+            <w:tcBorders>
+              <w:top w:val="single" w:sz="4" w:space="0" w:color="D9D9D9"/>
+              <w:left w:val="single" w:sz="4" w:space="0" w:color="D9D9D9"/>
+              <w:bottom w:val="single" w:sz="4" w:space="0" w:color="D9D9D9"/>
+              <w:right w:val="single" w:sz="4" w:space="0" w:color="D9D9D9"/>
+            </w:tcBorders>
           </w:tcPr>
           <w:p>
+            <w:pPr>
+              <w:jc w:val="center"/>
+            </w:pPr>
             <w:r>
               <w:rPr>
                 <w:rFonts w:ascii="Segoe UI" w:hAnsi="Segoe UI"/>
+                <w:color w:val="333333"/>
                 <w:sz w:val="18"/>
               </w:rPr>
               <w:t>—</w:t>
@@ -2263,46 +3636,76 @@
         </w:tc>
         <w:tc>
           <w:tcPr>
-            <w:tcW w:type="dxa" w:w="1949"/>
-            <w:shd w:val="clear" w:color="auto" w:fill="FFFFFF"/>
+            <w:tcW w:type="dxa" w:w="1728"/>
+            <w:shd w:val="clear" w:color="auto" w:fill="F2F6FC"/>
+            <w:tcBorders>
+              <w:top w:val="single" w:sz="4" w:space="0" w:color="D9D9D9"/>
+              <w:left w:val="single" w:sz="4" w:space="0" w:color="D9D9D9"/>
+              <w:bottom w:val="single" w:sz="4" w:space="0" w:color="D9D9D9"/>
+              <w:right w:val="single" w:sz="4" w:space="0" w:color="D9D9D9"/>
+            </w:tcBorders>
           </w:tcPr>
           <w:p>
+            <w:pPr>
+              <w:jc w:val="center"/>
+            </w:pPr>
             <w:r>
               <w:rPr>
                 <w:rFonts w:ascii="Segoe UI" w:hAnsi="Segoe UI"/>
+                <w:color w:val="333333"/>
                 <w:sz w:val="18"/>
               </w:rPr>
-              <w:t>20 / 24</w:t>
+              <w:t>20 / 24 (83.33%)</w:t>
             </w:r>
           </w:p>
         </w:tc>
         <w:tc>
           <w:tcPr>
-            <w:tcW w:type="dxa" w:w="1949"/>
-            <w:shd w:val="clear" w:color="auto" w:fill="FFFFFF"/>
+            <w:tcW w:type="dxa" w:w="1728"/>
+            <w:shd w:val="clear" w:color="auto" w:fill="F2F6FC"/>
+            <w:tcBorders>
+              <w:top w:val="single" w:sz="4" w:space="0" w:color="D9D9D9"/>
+              <w:left w:val="single" w:sz="4" w:space="0" w:color="D9D9D9"/>
+              <w:bottom w:val="single" w:sz="4" w:space="0" w:color="D9D9D9"/>
+              <w:right w:val="single" w:sz="4" w:space="0" w:color="D9D9D9"/>
+            </w:tcBorders>
           </w:tcPr>
           <w:p>
+            <w:pPr>
+              <w:jc w:val="center"/>
+            </w:pPr>
             <w:r>
               <w:rPr>
                 <w:rFonts w:ascii="Segoe UI" w:hAnsi="Segoe UI"/>
+                <w:color w:val="333333"/>
                 <w:sz w:val="18"/>
               </w:rPr>
-              <w:t>83.33%</w:t>
+              <w:t>23 / 24 (95.83%)</w:t>
             </w:r>
           </w:p>
         </w:tc>
         <w:tc>
           <w:tcPr>
-            <w:tcW w:type="dxa" w:w="1949"/>
-            <w:shd w:val="clear" w:color="auto" w:fill="FFFFFF"/>
+            <w:tcW w:type="dxa" w:w="1728"/>
+            <w:shd w:val="clear" w:color="auto" w:fill="F2F6FC"/>
+            <w:tcBorders>
+              <w:top w:val="single" w:sz="4" w:space="0" w:color="D9D9D9"/>
+              <w:left w:val="single" w:sz="4" w:space="0" w:color="D9D9D9"/>
+              <w:bottom w:val="single" w:sz="4" w:space="0" w:color="D9D9D9"/>
+              <w:right w:val="single" w:sz="4" w:space="0" w:color="D9D9D9"/>
+            </w:tcBorders>
           </w:tcPr>
           <w:p>
+            <w:pPr>
+              <w:jc w:val="left"/>
+            </w:pPr>
             <w:r>
               <w:rPr>
                 <w:rFonts w:ascii="Segoe UI" w:hAnsi="Segoe UI"/>
+                <w:color w:val="333333"/>
                 <w:sz w:val="18"/>
               </w:rPr>
-              <w:t>High real-world accuracy on unseen restaurant photography.</w:t>
+              <w:t>+12.50% OVERALL BOOST across real-world restaurant photography.</w:t>
             </w:r>
           </w:p>
         </w:tc>
@@ -2325,6 +3728,7 @@
     <w:p>
       <w:pPr>
         <w:pStyle w:val="ListBullet"/>
+        <w:spacing w:after="80"/>
       </w:pPr>
       <w:r>
         <w:rPr>
@@ -2333,19 +3737,21 @@
           <w:color w:val="1F3864"/>
           <w:sz w:val="20"/>
         </w:rPr>
-        <w:t>Package Directory:</w:t>
+        <w:t xml:space="preserve">Package Directory: </w:t>
       </w:r>
       <w:r>
         <w:rPr>
           <w:rFonts w:ascii="Segoe UI" w:hAnsi="Segoe UI"/>
+          <w:color w:val="333333"/>
           <w:sz w:val="20"/>
         </w:rPr>
-        <w:t xml:space="preserve">  Vegan_vs_Vegetarian_Classifier/</w:t>
+        <w:t>Vegan_vs_Vegetarian_Classifier/</w:t>
       </w:r>
     </w:p>
     <w:p>
       <w:pPr>
         <w:pStyle w:val="ListBullet"/>
+        <w:spacing w:after="80"/>
       </w:pPr>
       <w:r>
         <w:rPr>
@@ -2354,19 +3760,21 @@
           <w:color w:val="1F3864"/>
           <w:sz w:val="20"/>
         </w:rPr>
-        <w:t>Checkpoint Weights:</w:t>
+        <w:t xml:space="preserve">YOLOv8-Seg Checkpoint: </w:t>
       </w:r>
       <w:r>
         <w:rPr>
           <w:rFonts w:ascii="Segoe UI" w:hAnsi="Segoe UI"/>
+          <w:color w:val="333333"/>
           <w:sz w:val="20"/>
         </w:rPr>
-        <w:t xml:space="preserve">  Vegan_vs_Vegetarian_Classifier/checkpoints/mobilenet_v3_large_vegan_veg_best.pth</w:t>
+        <w:t>Vegan_vs_Vegetarian_Classifier/checkpoints/mobilenet_v3_large_vegan_veg_yolo_seg_best.pth</w:t>
       </w:r>
     </w:p>
     <w:p>
       <w:pPr>
         <w:pStyle w:val="ListBullet"/>
+        <w:spacing w:after="80"/>
       </w:pPr>
       <w:r>
         <w:rPr>
@@ -2375,19 +3783,21 @@
           <w:color w:val="1F3864"/>
           <w:sz w:val="20"/>
         </w:rPr>
-        <w:t>Inference Tool:</w:t>
+        <w:t xml:space="preserve">Baseline Checkpoint: </w:t>
       </w:r>
       <w:r>
         <w:rPr>
           <w:rFonts w:ascii="Segoe UI" w:hAnsi="Segoe UI"/>
+          <w:color w:val="333333"/>
           <w:sz w:val="20"/>
         </w:rPr>
-        <w:t xml:space="preserve">  .venv/bin/python Vegan_vs_Vegetarian_Classifier/scripts/predict.py --image &lt;path&gt;</w:t>
+        <w:t>Vegan_vs_Vegetarian_Classifier/checkpoints/mobilenet_v3_large_vegan_veg_best.pth</w:t>
       </w:r>
     </w:p>
     <w:p>
       <w:pPr>
         <w:pStyle w:val="ListBullet"/>
+        <w:spacing w:after="80"/>
       </w:pPr>
       <w:r>
         <w:rPr>
@@ -2396,19 +3806,21 @@
           <w:color w:val="1F3864"/>
           <w:sz w:val="20"/>
         </w:rPr>
-        <w:t>Split Evaluator:</w:t>
+        <w:t xml:space="preserve">Inference Tool (YOLO-Seg): </w:t>
       </w:r>
       <w:r>
         <w:rPr>
           <w:rFonts w:ascii="Segoe UI" w:hAnsi="Segoe UI"/>
+          <w:color w:val="333333"/>
           <w:sz w:val="20"/>
         </w:rPr>
-        <w:t xml:space="preserve">  .venv/bin/python Vegan_vs_Vegetarian_Classifier/scripts/evaluate.py --split test</w:t>
+        <w:t>.venv/bin/python Vegan_vs_Vegetarian_Classifier/scripts/predict.py --image &lt;path&gt; --yolo_seg</w:t>
       </w:r>
     </w:p>
     <w:p>
       <w:pPr>
         <w:pStyle w:val="ListBullet"/>
+        <w:spacing w:after="80"/>
       </w:pPr>
       <w:r>
         <w:rPr>
@@ -2417,19 +3829,43 @@
           <w:color w:val="1F3864"/>
           <w:sz w:val="20"/>
         </w:rPr>
-        <w:t>Restaurant Evaluator:</w:t>
+        <w:t xml:space="preserve">Inference Tool (Baseline): </w:t>
       </w:r>
       <w:r>
         <w:rPr>
           <w:rFonts w:ascii="Segoe UI" w:hAnsi="Segoe UI"/>
+          <w:color w:val="333333"/>
           <w:sz w:val="20"/>
         </w:rPr>
-        <w:t xml:space="preserve">  .venv/bin/python Vegan_vs_Vegetarian_Classifier/scripts/evaluate_restaurant.py</w:t>
+        <w:t>.venv/bin/python Vegan_vs_Vegetarian_Classifier/scripts/predict.py --image &lt;path&gt; --baseline</w:t>
+      </w:r>
+    </w:p>
+    <w:p>
+      <w:pPr>
+        <w:pStyle w:val="ListBullet"/>
+        <w:spacing w:after="80"/>
+      </w:pPr>
+      <w:r>
+        <w:rPr>
+          <w:rFonts w:ascii="Segoe UI" w:hAnsi="Segoe UI"/>
+          <w:b/>
+          <w:color w:val="1F3864"/>
+          <w:sz w:val="20"/>
+        </w:rPr>
+        <w:t xml:space="preserve">Restaurant Evaluator: </w:t>
+      </w:r>
+      <w:r>
+        <w:rPr>
+          <w:rFonts w:ascii="Segoe UI" w:hAnsi="Segoe UI"/>
+          <w:color w:val="333333"/>
+          <w:sz w:val="20"/>
+        </w:rPr>
+        <w:t>.venv/bin/python Vegan_vs_Vegetarian_Classifier/scripts/evaluate_restaurant.py --all</w:t>
       </w:r>
     </w:p>
     <w:sectPr>
       <w:pgSz w:w="12240" w:h="15840"/>
-      <w:pgMar w:top="1020" w:right="1247" w:bottom="1020" w:left="1247" w:header="720" w:footer="720" w:gutter="0"/>
+      <w:pgMar w:top="1440" w:right="1800" w:bottom="1440" w:left="1800" w:header="720" w:footer="720" w:gutter="0"/>
       <w:cols w:space="720"/>
       <w:docGrid w:linePitch="360"/>
     </w:sectPr>

</xml_diff>